<commit_message>
feat(documents): use Liberation Sans for templates and PDF rendering
</commit_message>
<xml_diff>
--- a/backend/src/main/resources/templates/documents/contract_application.docx
+++ b/backend/src/main/resources/templates/documents/contract_application.docx
@@ -1,6 +1,6 @@
 
 <file path=word/document.xml><?xml version="1.0" encoding="utf-8"?>
-<w:document xmlns:o="urn:schemas-microsoft-com:office:office" xmlns:r="http://schemas.openxmlformats.org/officeDocument/2006/relationships" xmlns:v="urn:schemas-microsoft-com:vml" xmlns:w="http://schemas.openxmlformats.org/wordprocessingml/2006/main" xmlns:w10="urn:schemas-microsoft-com:office:word" xmlns:wp="http://schemas.openxmlformats.org/drawingml/2006/wordprocessingDrawing" xmlns:wps="http://schemas.microsoft.com/office/word/2010/wordprocessingShape" xmlns:wpg="http://schemas.microsoft.com/office/word/2010/wordprocessingGroup" xmlns:mc="http://schemas.openxmlformats.org/markup-compatibility/2006" xmlns:wp14="http://schemas.microsoft.com/office/word/2010/wordprocessingDrawing" xmlns:w14="http://schemas.microsoft.com/office/word/2010/wordml" mc:Ignorable="w14 wp14">
+<w:document xmlns:o="urn:schemas-microsoft-com:office:office" xmlns:r="http://schemas.openxmlformats.org/officeDocument/2006/relationships" xmlns:v="urn:schemas-microsoft-com:vml" xmlns:w="http://schemas.openxmlformats.org/wordprocessingml/2006/main" xmlns:w10="urn:schemas-microsoft-com:office:word" xmlns:wp="http://schemas.openxmlformats.org/drawingml/2006/wordprocessingDrawing" xmlns:pic="http://schemas.openxmlformats.org/drawingml/2006/picture" xmlns:wps="http://schemas.microsoft.com/office/word/2010/wordprocessingShape" xmlns:wpg="http://schemas.microsoft.com/office/word/2010/wordprocessingGroup" xmlns:mc="http://schemas.openxmlformats.org/markup-compatibility/2006" xmlns:wp14="http://schemas.microsoft.com/office/word/2010/wordprocessingDrawing" xmlns:w14="http://schemas.microsoft.com/office/word/2010/wordml" xmlns:w15="http://schemas.microsoft.com/office/word/2012/wordml" mc:Ignorable="w14 wp14 w15">
   <w:background w:color="FFFFFF"/>
   <w:body>
     <w:tbl>
@@ -40,11 +40,13 @@
                 <w:tab w:val="left" w:pos="0" w:leader="none"/>
               </w:tabs>
               <w:spacing w:before="0" w:after="0"/>
-              <w:rPr/>
-            </w:pPr>
-            <w:r>
-              <w:rPr>
-                <w:rFonts w:cs="Arial" w:ascii="Arial" w:hAnsi="Arial"/>
+              <w:rPr>
+                <w:rFonts w:ascii="Liberation Sans" w:hAnsi="Liberation Sans"/>
+              </w:rPr>
+            </w:pPr>
+            <w:r>
+              <w:rPr>
+                <w:rFonts w:cs="Arial" w:ascii="Liberation Sans" w:hAnsi="Liberation Sans"/>
                 <w:b/>
                 <w:sz w:val="32"/>
                 <w:szCs w:val="32"/>
@@ -53,7 +55,7 @@
             </w:r>
             <w:r>
               <w:rPr>
-                <w:rFonts w:eastAsia="Times New Roman" w:cs="Courier New" w:ascii="Courier New" w:hAnsi="Courier New"/>
+                <w:rFonts w:eastAsia="Times New Roman" w:cs="Courier New" w:ascii="Liberation Sans" w:hAnsi="Liberation Sans"/>
                 <w:color w:val="auto"/>
                 <w:sz w:val="32"/>
                 <w:szCs w:val="32"/>
@@ -73,16 +75,12 @@
               </w:tabs>
               <w:spacing w:before="0" w:after="0"/>
               <w:rPr>
-                <w:rFonts w:ascii="Arial" w:hAnsi="Arial" w:cs="Arial"/>
-                <w:b/>
-                <w:b/>
-                <w:sz w:val="28"/>
-                <w:szCs w:val="28"/>
-              </w:rPr>
-            </w:pPr>
-            <w:r>
-              <w:rPr>
-                <w:rFonts w:cs="Arial" w:ascii="Arial" w:hAnsi="Arial"/>
+                <w:rFonts w:ascii="Liberation Sans" w:hAnsi="Liberation Sans"/>
+              </w:rPr>
+            </w:pPr>
+            <w:r>
+              <w:rPr>
+                <w:rFonts w:cs="Arial" w:ascii="Liberation Sans" w:hAnsi="Liberation Sans"/>
                 <w:b/>
                 <w:sz w:val="28"/>
                 <w:szCs w:val="28"/>
@@ -100,17 +98,12 @@
               </w:tabs>
               <w:spacing w:before="0" w:after="0"/>
               <w:rPr>
-                <w:rFonts w:ascii="Arial" w:hAnsi="Arial" w:cs="Arial"/>
-                <w:b/>
-                <w:b/>
-                <w:sz w:val="18"/>
-                <w:szCs w:val="18"/>
-                <w:u w:val="single"/>
-              </w:rPr>
-            </w:pPr>
-            <w:r>
-              <w:rPr>
-                <w:rFonts w:cs="Arial" w:ascii="Arial" w:hAnsi="Arial"/>
+                <w:rFonts w:ascii="Liberation Sans" w:hAnsi="Liberation Sans"/>
+              </w:rPr>
+            </w:pPr>
+            <w:r>
+              <w:rPr>
+                <w:rFonts w:cs="Arial" w:ascii="Liberation Sans" w:hAnsi="Liberation Sans"/>
                 <w:b/>
                 <w:sz w:val="28"/>
                 <w:szCs w:val="28"/>
@@ -119,7 +112,7 @@
             </w:r>
             <w:r>
               <w:rPr>
-                <w:rFonts w:cs="Arial" w:ascii="Arial" w:hAnsi="Arial"/>
+                <w:rFonts w:cs="Arial" w:ascii="Liberation Sans" w:hAnsi="Liberation Sans"/>
                 <w:b/>
                 <w:sz w:val="28"/>
                 <w:szCs w:val="28"/>
@@ -137,14 +130,14 @@
         <w:pStyle w:val="Normal"/>
         <w:spacing w:before="0" w:after="0"/>
         <w:rPr>
-          <w:rFonts w:ascii="Arial" w:hAnsi="Arial" w:cs="Arial"/>
+          <w:rFonts w:ascii="Liberation Sans" w:hAnsi="Liberation Sans" w:cs="Arial"/>
           <w:sz w:val="24"/>
           <w:szCs w:val="24"/>
         </w:rPr>
       </w:pPr>
       <w:r>
         <w:rPr>
-          <w:rFonts w:cs="Arial" w:ascii="Arial" w:hAnsi="Arial"/>
+          <w:rFonts w:cs="Arial" w:ascii="Liberation Sans" w:hAnsi="Liberation Sans"/>
           <w:sz w:val="24"/>
           <w:szCs w:val="24"/>
         </w:rPr>
@@ -192,33 +185,31 @@
               <w:snapToGrid w:val="false"/>
               <w:spacing w:before="0" w:after="0"/>
               <w:rPr>
-                <w:rFonts w:ascii="Arial" w:hAnsi="Arial" w:cs="Arial"/>
-                <w:sz w:val="18"/>
-                <w:szCs w:val="18"/>
-              </w:rPr>
-            </w:pPr>
-            <w:r>
-              <w:rPr>
-                <w:rFonts w:cs="Arial" w:ascii="Arial" w:hAnsi="Arial"/>
-                <w:sz w:val="18"/>
-                <w:szCs w:val="18"/>
-              </w:rPr>
-            </w:r>
-          </w:p>
-          <w:p>
-            <w:pPr>
-              <w:pStyle w:val="Normal"/>
-              <w:widowControl w:val="false"/>
-              <w:spacing w:before="0" w:after="0"/>
-              <w:rPr>
-                <w:rFonts w:ascii="Arial" w:hAnsi="Arial" w:cs="Arial"/>
-                <w:sz w:val="18"/>
-                <w:szCs w:val="18"/>
-              </w:rPr>
-            </w:pPr>
-            <w:r>
-              <w:rPr>
-                <w:rFonts w:cs="Arial" w:ascii="Arial" w:hAnsi="Arial"/>
+                <w:rFonts w:ascii="Liberation Sans" w:hAnsi="Liberation Sans" w:cs="Arial"/>
+                <w:sz w:val="18"/>
+                <w:szCs w:val="18"/>
+              </w:rPr>
+            </w:pPr>
+            <w:r>
+              <w:rPr>
+                <w:rFonts w:cs="Arial" w:ascii="Liberation Sans" w:hAnsi="Liberation Sans"/>
+                <w:sz w:val="18"/>
+                <w:szCs w:val="18"/>
+              </w:rPr>
+            </w:r>
+          </w:p>
+          <w:p>
+            <w:pPr>
+              <w:pStyle w:val="Normal"/>
+              <w:widowControl w:val="false"/>
+              <w:spacing w:before="0" w:after="0"/>
+              <w:rPr>
+                <w:rFonts w:ascii="Liberation Sans" w:hAnsi="Liberation Sans"/>
+              </w:rPr>
+            </w:pPr>
+            <w:r>
+              <w:rPr>
+                <w:rFonts w:cs="Arial" w:ascii="Liberation Sans" w:hAnsi="Liberation Sans"/>
                 <w:sz w:val="18"/>
                 <w:szCs w:val="18"/>
               </w:rPr>
@@ -239,27 +230,17 @@
           </w:tcPr>
           <w:p>
             <w:pPr>
-              <w:pStyle w:val="Style28"/>
+              <w:pStyle w:val="Style22"/>
               <w:widowControl w:val="false"/>
               <w:spacing w:before="0" w:after="200"/>
               <w:jc w:val="center"/>
               <w:rPr>
-                <w:rFonts w:ascii="TimesNewRomanPSMT;Times New Roman" w:hAnsi="TimesNewRomanPSMT;Times New Roman" w:eastAsia="Courier New" w:cs="TimesNewRomanPSMT;Times New Roman"/>
-                <w:b/>
-                <w:b/>
-                <w:bCs/>
-                <w:i w:val="false"/>
-                <w:i w:val="false"/>
-                <w:iCs w:val="false"/>
-                <w:color w:val="000000"/>
-                <w:sz w:val="22"/>
-                <w:szCs w:val="22"/>
-                <w:lang w:val="en-US" w:eastAsia="zh-CN" w:bidi="ar-SA"/>
-              </w:rPr>
-            </w:pPr>
-            <w:r>
-              <w:rPr>
-                <w:rFonts w:eastAsia="Courier New" w:cs="TimesNewRomanPSMT;Times New Roman" w:ascii="TimesNewRomanPSMT;Times New Roman" w:hAnsi="TimesNewRomanPSMT;Times New Roman"/>
+                <w:rFonts w:ascii="Liberation Sans" w:hAnsi="Liberation Sans"/>
+              </w:rPr>
+            </w:pPr>
+            <w:r>
+              <w:rPr>
+                <w:rFonts w:eastAsia="Courier New" w:cs="TimesNewRomanPSMT;Times New Roman" w:ascii="Liberation Sans" w:hAnsi="Liberation Sans"/>
                 <w:b/>
                 <w:bCs/>
                 <w:i w:val="false"/>
@@ -290,36 +271,33 @@
               <w:snapToGrid w:val="false"/>
               <w:spacing w:before="0" w:after="0"/>
               <w:rPr>
-                <w:rFonts w:ascii="Arial" w:hAnsi="Arial" w:cs="Arial"/>
-                <w:b/>
-                <w:b/>
-                <w:sz w:val="18"/>
-                <w:szCs w:val="18"/>
-              </w:rPr>
-            </w:pPr>
-            <w:r>
-              <w:rPr>
-                <w:rFonts w:cs="Arial" w:ascii="Arial" w:hAnsi="Arial"/>
-                <w:b/>
-                <w:sz w:val="18"/>
-                <w:szCs w:val="18"/>
-              </w:rPr>
-            </w:r>
-          </w:p>
-          <w:p>
-            <w:pPr>
-              <w:pStyle w:val="Normal"/>
-              <w:widowControl w:val="false"/>
-              <w:spacing w:before="0" w:after="0"/>
-              <w:rPr>
-                <w:rFonts w:ascii="Arial" w:hAnsi="Arial" w:cs="Arial"/>
-                <w:sz w:val="18"/>
-                <w:szCs w:val="18"/>
-              </w:rPr>
-            </w:pPr>
-            <w:r>
-              <w:rPr>
-                <w:rFonts w:cs="Arial" w:ascii="Arial" w:hAnsi="Arial"/>
+                <w:rFonts w:ascii="Liberation Sans" w:hAnsi="Liberation Sans" w:cs="Arial"/>
+                <w:b/>
+                <w:sz w:val="18"/>
+                <w:szCs w:val="18"/>
+              </w:rPr>
+            </w:pPr>
+            <w:r>
+              <w:rPr>
+                <w:rFonts w:cs="Arial" w:ascii="Liberation Sans" w:hAnsi="Liberation Sans"/>
+                <w:b/>
+                <w:sz w:val="18"/>
+                <w:szCs w:val="18"/>
+              </w:rPr>
+            </w:r>
+          </w:p>
+          <w:p>
+            <w:pPr>
+              <w:pStyle w:val="Normal"/>
+              <w:widowControl w:val="false"/>
+              <w:spacing w:before="0" w:after="0"/>
+              <w:rPr>
+                <w:rFonts w:ascii="Liberation Sans" w:hAnsi="Liberation Sans"/>
+              </w:rPr>
+            </w:pPr>
+            <w:r>
+              <w:rPr>
+                <w:rFonts w:cs="Arial" w:ascii="Liberation Sans" w:hAnsi="Liberation Sans"/>
                 <w:sz w:val="18"/>
                 <w:szCs w:val="18"/>
               </w:rPr>
@@ -346,14 +324,12 @@
               <w:spacing w:lineRule="auto" w:line="240" w:before="0" w:after="200"/>
               <w:jc w:val="both"/>
               <w:rPr>
-                <w:i w:val="false"/>
-                <w:i w:val="false"/>
-                <w:iCs w:val="false"/>
-                <w:lang w:val="en-US"/>
-              </w:rPr>
-            </w:pPr>
-            <w:r>
-              <w:rPr>
+                <w:rFonts w:ascii="Liberation Sans" w:hAnsi="Liberation Sans"/>
+              </w:rPr>
+            </w:pPr>
+            <w:r>
+              <w:rPr>
+                <w:rFonts w:ascii="Liberation Sans" w:hAnsi="Liberation Sans"/>
                 <w:i w:val="false"/>
                 <w:iCs w:val="false"/>
                 <w:lang w:val="en-US"/>
@@ -382,7 +358,7 @@
               <w:snapToGrid w:val="false"/>
               <w:spacing w:before="0" w:after="0"/>
               <w:rPr>
-                <w:rFonts w:ascii="Arial" w:hAnsi="Arial" w:cs="Arial"/>
+                <w:rFonts w:ascii="Liberation Sans" w:hAnsi="Liberation Sans" w:cs="Arial"/>
                 <w:i/>
                 <w:i/>
                 <w:sz w:val="18"/>
@@ -391,7 +367,7 @@
             </w:pPr>
             <w:r>
               <w:rPr>
-                <w:rFonts w:cs="Arial" w:ascii="Arial" w:hAnsi="Arial"/>
+                <w:rFonts w:cs="Arial" w:ascii="Liberation Sans" w:hAnsi="Liberation Sans"/>
                 <w:i/>
                 <w:sz w:val="18"/>
                 <w:szCs w:val="18"/>
@@ -404,14 +380,12 @@
               <w:widowControl w:val="false"/>
               <w:spacing w:before="0" w:after="0"/>
               <w:rPr>
-                <w:rFonts w:ascii="Arial" w:hAnsi="Arial" w:cs="Arial"/>
-                <w:sz w:val="18"/>
-                <w:szCs w:val="18"/>
-              </w:rPr>
-            </w:pPr>
-            <w:r>
-              <w:rPr>
-                <w:rFonts w:cs="Arial" w:ascii="Arial" w:hAnsi="Arial"/>
+                <w:rFonts w:ascii="Liberation Sans" w:hAnsi="Liberation Sans"/>
+              </w:rPr>
+            </w:pPr>
+            <w:r>
+              <w:rPr>
+                <w:rFonts w:cs="Arial" w:ascii="Liberation Sans" w:hAnsi="Liberation Sans"/>
                 <w:sz w:val="18"/>
                 <w:szCs w:val="18"/>
               </w:rPr>
@@ -436,11 +410,13 @@
               <w:pStyle w:val="Normal"/>
               <w:widowControl w:val="false"/>
               <w:spacing w:before="0" w:after="0"/>
-              <w:rPr/>
-            </w:pPr>
-            <w:r>
-              <w:rPr>
-                <w:rFonts w:eastAsia="Times New Roman" w:cs="Arial" w:ascii="Arial" w:hAnsi="Arial"/>
+              <w:rPr>
+                <w:rFonts w:ascii="Liberation Sans" w:hAnsi="Liberation Sans"/>
+              </w:rPr>
+            </w:pPr>
+            <w:r>
+              <w:rPr>
+                <w:rFonts w:eastAsia="Times New Roman" w:cs="Arial" w:ascii="Liberation Sans" w:hAnsi="Liberation Sans"/>
                 <w:color w:val="000000"/>
                 <w:sz w:val="23"/>
                 <w:szCs w:val="23"/>
@@ -455,11 +431,13 @@
               <w:pStyle w:val="Normal"/>
               <w:widowControl w:val="false"/>
               <w:spacing w:before="0" w:after="0"/>
-              <w:rPr/>
-            </w:pPr>
-            <w:r>
-              <w:rPr>
-                <w:rFonts w:eastAsia="Times New Roman" w:cs="Arial" w:ascii="Arial" w:hAnsi="Arial"/>
+              <w:rPr>
+                <w:rFonts w:ascii="Liberation Sans" w:hAnsi="Liberation Sans"/>
+              </w:rPr>
+            </w:pPr>
+            <w:r>
+              <w:rPr>
+                <w:rFonts w:eastAsia="Times New Roman" w:cs="Arial" w:ascii="Liberation Sans" w:hAnsi="Liberation Sans"/>
                 <w:color w:val="000000"/>
                 <w:sz w:val="23"/>
                 <w:szCs w:val="23"/>
@@ -490,36 +468,33 @@
               <w:snapToGrid w:val="false"/>
               <w:spacing w:before="0" w:after="0"/>
               <w:rPr>
-                <w:rFonts w:ascii="Arial" w:hAnsi="Arial" w:cs="Arial"/>
-                <w:b/>
-                <w:b/>
-                <w:sz w:val="18"/>
-                <w:szCs w:val="18"/>
-              </w:rPr>
-            </w:pPr>
-            <w:r>
-              <w:rPr>
-                <w:rFonts w:cs="Arial" w:ascii="Arial" w:hAnsi="Arial"/>
-                <w:b/>
-                <w:sz w:val="18"/>
-                <w:szCs w:val="18"/>
-              </w:rPr>
-            </w:r>
-          </w:p>
-          <w:p>
-            <w:pPr>
-              <w:pStyle w:val="Normal"/>
-              <w:widowControl w:val="false"/>
-              <w:spacing w:before="0" w:after="0"/>
-              <w:rPr>
-                <w:rFonts w:ascii="Arial" w:hAnsi="Arial" w:cs="Arial"/>
-                <w:sz w:val="18"/>
-                <w:szCs w:val="18"/>
-              </w:rPr>
-            </w:pPr>
-            <w:r>
-              <w:rPr>
-                <w:rFonts w:cs="Arial" w:ascii="Arial" w:hAnsi="Arial"/>
+                <w:rFonts w:ascii="Liberation Sans" w:hAnsi="Liberation Sans" w:cs="Arial"/>
+                <w:b/>
+                <w:sz w:val="18"/>
+                <w:szCs w:val="18"/>
+              </w:rPr>
+            </w:pPr>
+            <w:r>
+              <w:rPr>
+                <w:rFonts w:cs="Arial" w:ascii="Liberation Sans" w:hAnsi="Liberation Sans"/>
+                <w:b/>
+                <w:sz w:val="18"/>
+                <w:szCs w:val="18"/>
+              </w:rPr>
+            </w:r>
+          </w:p>
+          <w:p>
+            <w:pPr>
+              <w:pStyle w:val="Normal"/>
+              <w:widowControl w:val="false"/>
+              <w:spacing w:before="0" w:after="0"/>
+              <w:rPr>
+                <w:rFonts w:ascii="Liberation Sans" w:hAnsi="Liberation Sans"/>
+              </w:rPr>
+            </w:pPr>
+            <w:r>
+              <w:rPr>
+                <w:rFonts w:cs="Arial" w:ascii="Liberation Sans" w:hAnsi="Liberation Sans"/>
                 <w:sz w:val="18"/>
                 <w:szCs w:val="18"/>
               </w:rPr>
@@ -545,16 +520,12 @@
               <w:widowControl w:val="false"/>
               <w:spacing w:before="0" w:after="0"/>
               <w:rPr>
-                <w:rFonts w:ascii="Arial" w:hAnsi="Arial" w:cs="Arial"/>
-                <w:color w:val="000000"/>
-                <w:sz w:val="23"/>
-                <w:szCs w:val="23"/>
-                <w:highlight w:val="white"/>
-              </w:rPr>
-            </w:pPr>
-            <w:r>
-              <w:rPr>
-                <w:rFonts w:eastAsia="Times New Roman" w:cs="Arial" w:ascii="Arial" w:hAnsi="Arial"/>
+                <w:rFonts w:ascii="Liberation Sans" w:hAnsi="Liberation Sans"/>
+              </w:rPr>
+            </w:pPr>
+            <w:r>
+              <w:rPr>
+                <w:rFonts w:eastAsia="Times New Roman" w:cs="Arial" w:ascii="Liberation Sans" w:hAnsi="Liberation Sans"/>
                 <w:color w:val="000000"/>
                 <w:sz w:val="23"/>
                 <w:szCs w:val="23"/>
@@ -571,16 +542,12 @@
               <w:widowControl w:val="false"/>
               <w:spacing w:before="0" w:after="0"/>
               <w:rPr>
-                <w:rFonts w:ascii="Arial" w:hAnsi="Arial" w:cs="Arial"/>
-                <w:color w:val="000000"/>
-                <w:sz w:val="23"/>
-                <w:szCs w:val="23"/>
-                <w:highlight w:val="white"/>
-              </w:rPr>
-            </w:pPr>
-            <w:r>
-              <w:rPr>
-                <w:rFonts w:eastAsia="Times New Roman" w:cs="Arial" w:ascii="Arial" w:hAnsi="Arial"/>
+                <w:rFonts w:ascii="Liberation Sans" w:hAnsi="Liberation Sans"/>
+              </w:rPr>
+            </w:pPr>
+            <w:r>
+              <w:rPr>
+                <w:rFonts w:eastAsia="Times New Roman" w:cs="Arial" w:ascii="Liberation Sans" w:hAnsi="Liberation Sans"/>
                 <w:color w:val="000000"/>
                 <w:sz w:val="23"/>
                 <w:szCs w:val="23"/>
@@ -614,32 +581,33 @@
               <w:snapToGrid w:val="false"/>
               <w:spacing w:before="0" w:after="0"/>
               <w:rPr>
-                <w:rFonts w:ascii="Arial" w:hAnsi="Arial" w:cs="Arial"/>
-                <w:b/>
-                <w:b/>
-                <w:sz w:val="18"/>
-                <w:szCs w:val="18"/>
-              </w:rPr>
-            </w:pPr>
-            <w:r>
-              <w:rPr>
-                <w:rFonts w:cs="Arial" w:ascii="Arial" w:hAnsi="Arial"/>
-                <w:b/>
-                <w:sz w:val="18"/>
-                <w:szCs w:val="18"/>
-              </w:rPr>
-            </w:r>
-          </w:p>
-          <w:p>
-            <w:pPr>
-              <w:pStyle w:val="Normal"/>
-              <w:widowControl w:val="false"/>
-              <w:spacing w:before="0" w:after="0"/>
-              <w:rPr/>
-            </w:pPr>
-            <w:r>
-              <w:rPr>
-                <w:rFonts w:cs="Arial" w:ascii="Arial" w:hAnsi="Arial"/>
+                <w:rFonts w:ascii="Liberation Sans" w:hAnsi="Liberation Sans" w:cs="Arial"/>
+                <w:b/>
+                <w:sz w:val="18"/>
+                <w:szCs w:val="18"/>
+              </w:rPr>
+            </w:pPr>
+            <w:r>
+              <w:rPr>
+                <w:rFonts w:cs="Arial" w:ascii="Liberation Sans" w:hAnsi="Liberation Sans"/>
+                <w:b/>
+                <w:sz w:val="18"/>
+                <w:szCs w:val="18"/>
+              </w:rPr>
+            </w:r>
+          </w:p>
+          <w:p>
+            <w:pPr>
+              <w:pStyle w:val="Normal"/>
+              <w:widowControl w:val="false"/>
+              <w:spacing w:before="0" w:after="0"/>
+              <w:rPr>
+                <w:rFonts w:ascii="Liberation Sans" w:hAnsi="Liberation Sans"/>
+              </w:rPr>
+            </w:pPr>
+            <w:r>
+              <w:rPr>
+                <w:rFonts w:cs="Arial" w:ascii="Liberation Sans" w:hAnsi="Liberation Sans"/>
                 <w:sz w:val="18"/>
                 <w:szCs w:val="18"/>
               </w:rPr>
@@ -647,7 +615,7 @@
             </w:r>
             <w:r>
               <w:rPr>
-                <w:rFonts w:cs="Arial" w:ascii="Arial" w:hAnsi="Arial"/>
+                <w:rFonts w:cs="Arial" w:ascii="Liberation Sans" w:hAnsi="Liberation Sans"/>
                 <w:i/>
                 <w:sz w:val="16"/>
                 <w:szCs w:val="16"/>
@@ -673,11 +641,13 @@
               <w:pStyle w:val="Normal"/>
               <w:widowControl w:val="false"/>
               <w:spacing w:before="0" w:after="0"/>
-              <w:rPr/>
-            </w:pPr>
-            <w:r>
-              <w:rPr>
-                <w:rFonts w:cs="Times New Roman" w:ascii="Times New Roman" w:hAnsi="Times New Roman"/>
+              <w:rPr>
+                <w:rFonts w:ascii="Liberation Sans" w:hAnsi="Liberation Sans"/>
+              </w:rPr>
+            </w:pPr>
+            <w:r>
+              <w:rPr>
+                <w:rFonts w:cs="Times New Roman" w:ascii="Liberation Sans" w:hAnsi="Liberation Sans"/>
                 <w:b/>
                 <w:sz w:val="18"/>
                 <w:szCs w:val="18"/>
@@ -686,7 +656,7 @@
             </w:r>
             <w:r>
               <w:rPr>
-                <w:rFonts w:eastAsia="Times New Roman" w:cs="Times New Roman" w:ascii="Times New Roman" w:hAnsi="Times New Roman"/>
+                <w:rFonts w:eastAsia="Times New Roman" w:cs="Times New Roman" w:ascii="Liberation Sans" w:hAnsi="Liberation Sans"/>
                 <w:b/>
                 <w:color w:val="auto"/>
                 <w:sz w:val="18"/>
@@ -716,14 +686,12 @@
               <w:widowControl w:val="false"/>
               <w:spacing w:before="0" w:after="0"/>
               <w:rPr>
-                <w:rFonts w:ascii="Arial" w:hAnsi="Arial" w:cs="Arial"/>
-                <w:sz w:val="18"/>
-                <w:szCs w:val="18"/>
-              </w:rPr>
-            </w:pPr>
-            <w:r>
-              <w:rPr>
-                <w:rFonts w:cs="Arial" w:ascii="Arial" w:hAnsi="Arial"/>
+                <w:rFonts w:ascii="Liberation Sans" w:hAnsi="Liberation Sans"/>
+              </w:rPr>
+            </w:pPr>
+            <w:r>
+              <w:rPr>
+                <w:rFonts w:cs="Arial" w:ascii="Liberation Sans" w:hAnsi="Liberation Sans"/>
                 <w:sz w:val="18"/>
                 <w:szCs w:val="18"/>
               </w:rPr>
@@ -736,14 +704,12 @@
               <w:widowControl w:val="false"/>
               <w:spacing w:before="0" w:after="0"/>
               <w:rPr>
-                <w:rFonts w:ascii="Arial" w:hAnsi="Arial" w:cs="Arial"/>
-                <w:sz w:val="18"/>
-                <w:szCs w:val="18"/>
-              </w:rPr>
-            </w:pPr>
-            <w:r>
-              <w:rPr>
-                <w:rFonts w:cs="Arial" w:ascii="Arial" w:hAnsi="Arial"/>
+                <w:rFonts w:ascii="Liberation Sans" w:hAnsi="Liberation Sans"/>
+              </w:rPr>
+            </w:pPr>
+            <w:r>
+              <w:rPr>
+                <w:rFonts w:cs="Arial" w:ascii="Liberation Sans" w:hAnsi="Liberation Sans"/>
                 <w:sz w:val="18"/>
                 <w:szCs w:val="18"/>
               </w:rPr>
@@ -769,16 +735,12 @@
               <w:widowControl w:val="false"/>
               <w:spacing w:before="0" w:after="0"/>
               <w:rPr>
-                <w:rFonts w:ascii="Times New Roman" w:hAnsi="Times New Roman" w:cs="Times New Roman"/>
-                <w:b/>
-                <w:b/>
-                <w:sz w:val="18"/>
-                <w:szCs w:val="18"/>
-              </w:rPr>
-            </w:pPr>
-            <w:r>
-              <w:rPr>
-                <w:rFonts w:cs="Times New Roman" w:ascii="Times New Roman" w:hAnsi="Times New Roman"/>
+                <w:rFonts w:ascii="Liberation Sans" w:hAnsi="Liberation Sans"/>
+              </w:rPr>
+            </w:pPr>
+            <w:r>
+              <w:rPr>
+                <w:rFonts w:cs="Times New Roman" w:ascii="Liberation Sans" w:hAnsi="Liberation Sans"/>
                 <w:b/>
                 <w:sz w:val="18"/>
                 <w:szCs w:val="18"/>
@@ -806,14 +768,12 @@
               <w:widowControl w:val="false"/>
               <w:spacing w:before="0" w:after="0"/>
               <w:rPr>
-                <w:rFonts w:ascii="Arial" w:hAnsi="Arial" w:cs="Arial"/>
-                <w:sz w:val="18"/>
-                <w:szCs w:val="18"/>
-              </w:rPr>
-            </w:pPr>
-            <w:r>
-              <w:rPr>
-                <w:rFonts w:cs="Arial" w:ascii="Arial" w:hAnsi="Arial"/>
+                <w:rFonts w:ascii="Liberation Sans" w:hAnsi="Liberation Sans"/>
+              </w:rPr>
+            </w:pPr>
+            <w:r>
+              <w:rPr>
+                <w:rFonts w:cs="Arial" w:ascii="Liberation Sans" w:hAnsi="Liberation Sans"/>
                 <w:sz w:val="18"/>
                 <w:szCs w:val="18"/>
               </w:rPr>
@@ -826,14 +786,12 @@
               <w:widowControl w:val="false"/>
               <w:spacing w:before="0" w:after="0"/>
               <w:rPr>
-                <w:rFonts w:ascii="Arial" w:hAnsi="Arial" w:cs="Arial"/>
-                <w:sz w:val="18"/>
-                <w:szCs w:val="18"/>
-              </w:rPr>
-            </w:pPr>
-            <w:r>
-              <w:rPr>
-                <w:rFonts w:cs="Arial" w:ascii="Arial" w:hAnsi="Arial"/>
+                <w:rFonts w:ascii="Liberation Sans" w:hAnsi="Liberation Sans"/>
+              </w:rPr>
+            </w:pPr>
+            <w:r>
+              <w:rPr>
+                <w:rFonts w:cs="Arial" w:ascii="Liberation Sans" w:hAnsi="Liberation Sans"/>
                 <w:sz w:val="18"/>
                 <w:szCs w:val="18"/>
               </w:rPr>
@@ -858,11 +816,13 @@
               <w:pStyle w:val="Normal"/>
               <w:widowControl w:val="false"/>
               <w:spacing w:before="0" w:after="0"/>
-              <w:rPr/>
-            </w:pPr>
-            <w:r>
-              <w:rPr>
-                <w:rFonts w:eastAsia="Times New Roman" w:cs="Times New Roman" w:ascii="Times New Roman" w:hAnsi="Times New Roman"/>
+              <w:rPr>
+                <w:rFonts w:ascii="Liberation Sans" w:hAnsi="Liberation Sans"/>
+              </w:rPr>
+            </w:pPr>
+            <w:r>
+              <w:rPr>
+                <w:rFonts w:eastAsia="Times New Roman" w:cs="Times New Roman" w:ascii="Liberation Sans" w:hAnsi="Liberation Sans"/>
                 <w:b/>
                 <w:color w:val="auto"/>
                 <w:sz w:val="18"/>
@@ -873,7 +833,7 @@
             </w:r>
             <w:r>
               <w:rPr>
-                <w:rFonts w:cs="Times New Roman" w:ascii="Times New Roman" w:hAnsi="Times New Roman"/>
+                <w:rFonts w:cs="Times New Roman" w:ascii="Liberation Sans" w:hAnsi="Liberation Sans"/>
                 <w:b/>
                 <w:sz w:val="18"/>
                 <w:szCs w:val="18"/>
@@ -889,12 +849,14 @@
         <w:pStyle w:val="Normal"/>
         <w:spacing w:lineRule="auto" w:line="240" w:before="0" w:after="0"/>
         <w:rPr>
+          <w:rFonts w:ascii="Liberation Sans" w:hAnsi="Liberation Sans"/>
           <w:sz w:val="10"/>
           <w:szCs w:val="10"/>
         </w:rPr>
       </w:pPr>
       <w:r>
         <w:rPr>
+          <w:rFonts w:ascii="Liberation Sans" w:hAnsi="Liberation Sans"/>
           <w:sz w:val="10"/>
           <w:szCs w:val="10"/>
         </w:rPr>
@@ -940,33 +902,31 @@
               <w:snapToGrid w:val="false"/>
               <w:spacing w:before="0" w:after="0"/>
               <w:rPr>
-                <w:rFonts w:ascii="Arial" w:hAnsi="Arial" w:cs="Arial"/>
-                <w:sz w:val="18"/>
-                <w:szCs w:val="18"/>
-              </w:rPr>
-            </w:pPr>
-            <w:r>
-              <w:rPr>
-                <w:rFonts w:cs="Arial" w:ascii="Arial" w:hAnsi="Arial"/>
-                <w:sz w:val="18"/>
-                <w:szCs w:val="18"/>
-              </w:rPr>
-            </w:r>
-          </w:p>
-          <w:p>
-            <w:pPr>
-              <w:pStyle w:val="Normal"/>
-              <w:widowControl w:val="false"/>
-              <w:spacing w:before="0" w:after="0"/>
-              <w:rPr>
-                <w:rFonts w:ascii="Arial" w:hAnsi="Arial" w:cs="Arial"/>
-                <w:sz w:val="18"/>
-                <w:szCs w:val="18"/>
-              </w:rPr>
-            </w:pPr>
-            <w:r>
-              <w:rPr>
-                <w:rFonts w:cs="Arial" w:ascii="Arial" w:hAnsi="Arial"/>
+                <w:rFonts w:ascii="Liberation Sans" w:hAnsi="Liberation Sans" w:cs="Arial"/>
+                <w:sz w:val="18"/>
+                <w:szCs w:val="18"/>
+              </w:rPr>
+            </w:pPr>
+            <w:r>
+              <w:rPr>
+                <w:rFonts w:cs="Arial" w:ascii="Liberation Sans" w:hAnsi="Liberation Sans"/>
+                <w:sz w:val="18"/>
+                <w:szCs w:val="18"/>
+              </w:rPr>
+            </w:r>
+          </w:p>
+          <w:p>
+            <w:pPr>
+              <w:pStyle w:val="Normal"/>
+              <w:widowControl w:val="false"/>
+              <w:spacing w:before="0" w:after="0"/>
+              <w:rPr>
+                <w:rFonts w:ascii="Liberation Sans" w:hAnsi="Liberation Sans"/>
+              </w:rPr>
+            </w:pPr>
+            <w:r>
+              <w:rPr>
+                <w:rFonts w:cs="Arial" w:ascii="Liberation Sans" w:hAnsi="Liberation Sans"/>
                 <w:sz w:val="18"/>
                 <w:szCs w:val="18"/>
               </w:rPr>
@@ -991,16 +951,12 @@
               <w:widowControl w:val="false"/>
               <w:spacing w:before="0" w:after="0"/>
               <w:rPr>
-                <w:rFonts w:eastAsia="Times New Roman" w:cs="Times New Roman"/>
-                <w:color w:val="auto"/>
-                <w:sz w:val="22"/>
-                <w:szCs w:val="22"/>
-                <w:lang w:val="en-US" w:eastAsia="zh-CN" w:bidi="ar-SA"/>
-              </w:rPr>
-            </w:pPr>
-            <w:r>
-              <w:rPr>
-                <w:rFonts w:eastAsia="Times New Roman" w:cs="Times New Roman"/>
+                <w:rFonts w:ascii="Liberation Sans" w:hAnsi="Liberation Sans"/>
+              </w:rPr>
+            </w:pPr>
+            <w:r>
+              <w:rPr>
+                <w:rFonts w:eastAsia="Times New Roman" w:cs="Times New Roman" w:ascii="Liberation Sans" w:hAnsi="Liberation Sans"/>
                 <w:color w:val="auto"/>
                 <w:sz w:val="22"/>
                 <w:szCs w:val="22"/>
@@ -1027,8 +983,7 @@
               <w:snapToGrid w:val="false"/>
               <w:spacing w:lineRule="auto" w:line="240" w:before="0" w:after="0"/>
               <w:rPr>
-                <w:rFonts w:ascii="Arial" w:hAnsi="Arial" w:cs="Arial"/>
-                <w:b/>
+                <w:rFonts w:ascii="Liberation Sans" w:hAnsi="Liberation Sans" w:cs="Arial"/>
                 <w:b/>
                 <w:sz w:val="18"/>
                 <w:szCs w:val="18"/>
@@ -1037,7 +992,7 @@
             </w:pPr>
             <w:r>
               <w:rPr>
-                <w:rFonts w:cs="Arial" w:ascii="Arial" w:hAnsi="Arial"/>
+                <w:rFonts w:cs="Arial" w:ascii="Liberation Sans" w:hAnsi="Liberation Sans"/>
                 <w:b/>
                 <w:sz w:val="18"/>
                 <w:szCs w:val="18"/>
@@ -1051,14 +1006,12 @@
               <w:widowControl w:val="false"/>
               <w:spacing w:before="0" w:after="0"/>
               <w:rPr>
-                <w:rFonts w:ascii="Arial" w:hAnsi="Arial" w:cs="Arial"/>
-                <w:sz w:val="18"/>
-                <w:szCs w:val="18"/>
-              </w:rPr>
-            </w:pPr>
-            <w:r>
-              <w:rPr>
-                <w:rFonts w:cs="Arial" w:ascii="Arial" w:hAnsi="Arial"/>
+                <w:rFonts w:ascii="Liberation Sans" w:hAnsi="Liberation Sans"/>
+              </w:rPr>
+            </w:pPr>
+            <w:r>
+              <w:rPr>
+                <w:rFonts w:cs="Arial" w:ascii="Liberation Sans" w:hAnsi="Liberation Sans"/>
                 <w:sz w:val="18"/>
                 <w:szCs w:val="18"/>
               </w:rPr>
@@ -1084,16 +1037,12 @@
               <w:widowControl w:val="false"/>
               <w:spacing w:before="0" w:after="0"/>
               <w:rPr>
-                <w:rFonts w:eastAsia="Times New Roman" w:cs="Times New Roman"/>
-                <w:color w:val="auto"/>
-                <w:sz w:val="22"/>
-                <w:szCs w:val="22"/>
-                <w:lang w:val="en-US" w:eastAsia="zh-CN" w:bidi="ar-SA"/>
-              </w:rPr>
-            </w:pPr>
-            <w:r>
-              <w:rPr>
-                <w:rFonts w:eastAsia="Times New Roman" w:cs="Times New Roman"/>
+                <w:rFonts w:ascii="Liberation Sans" w:hAnsi="Liberation Sans"/>
+              </w:rPr>
+            </w:pPr>
+            <w:r>
+              <w:rPr>
+                <w:rFonts w:eastAsia="Times New Roman" w:cs="Times New Roman" w:ascii="Liberation Sans" w:hAnsi="Liberation Sans"/>
                 <w:color w:val="auto"/>
                 <w:sz w:val="22"/>
                 <w:szCs w:val="22"/>
@@ -1123,36 +1072,33 @@
               <w:snapToGrid w:val="false"/>
               <w:spacing w:before="0" w:after="0"/>
               <w:rPr>
-                <w:rFonts w:ascii="Arial" w:hAnsi="Arial" w:cs="Arial"/>
-                <w:b/>
-                <w:b/>
-                <w:sz w:val="18"/>
-                <w:szCs w:val="18"/>
-              </w:rPr>
-            </w:pPr>
-            <w:r>
-              <w:rPr>
-                <w:rFonts w:cs="Arial" w:ascii="Arial" w:hAnsi="Arial"/>
-                <w:b/>
-                <w:sz w:val="18"/>
-                <w:szCs w:val="18"/>
-              </w:rPr>
-            </w:r>
-          </w:p>
-          <w:p>
-            <w:pPr>
-              <w:pStyle w:val="Normal"/>
-              <w:widowControl w:val="false"/>
-              <w:spacing w:before="0" w:after="0"/>
-              <w:rPr>
-                <w:rFonts w:ascii="Arial" w:hAnsi="Arial" w:cs="Arial"/>
-                <w:sz w:val="18"/>
-                <w:szCs w:val="18"/>
-              </w:rPr>
-            </w:pPr>
-            <w:r>
-              <w:rPr>
-                <w:rFonts w:cs="Arial" w:ascii="Arial" w:hAnsi="Arial"/>
+                <w:rFonts w:ascii="Liberation Sans" w:hAnsi="Liberation Sans" w:cs="Arial"/>
+                <w:b/>
+                <w:sz w:val="18"/>
+                <w:szCs w:val="18"/>
+              </w:rPr>
+            </w:pPr>
+            <w:r>
+              <w:rPr>
+                <w:rFonts w:cs="Arial" w:ascii="Liberation Sans" w:hAnsi="Liberation Sans"/>
+                <w:b/>
+                <w:sz w:val="18"/>
+                <w:szCs w:val="18"/>
+              </w:rPr>
+            </w:r>
+          </w:p>
+          <w:p>
+            <w:pPr>
+              <w:pStyle w:val="Normal"/>
+              <w:widowControl w:val="false"/>
+              <w:spacing w:before="0" w:after="0"/>
+              <w:rPr>
+                <w:rFonts w:ascii="Liberation Sans" w:hAnsi="Liberation Sans"/>
+              </w:rPr>
+            </w:pPr>
+            <w:r>
+              <w:rPr>
+                <w:rFonts w:cs="Arial" w:ascii="Liberation Sans" w:hAnsi="Liberation Sans"/>
                 <w:sz w:val="18"/>
                 <w:szCs w:val="18"/>
               </w:rPr>
@@ -1177,18 +1123,12 @@
               <w:widowControl w:val="false"/>
               <w:spacing w:before="0" w:after="0"/>
               <w:rPr>
-                <w:rFonts w:ascii="Times New Roman" w:hAnsi="Times New Roman" w:eastAsia="Times New Roman" w:cs="Times New Roman"/>
-                <w:b/>
-                <w:b/>
-                <w:color w:val="auto"/>
-                <w:sz w:val="18"/>
-                <w:szCs w:val="18"/>
-                <w:lang w:val="en-US" w:eastAsia="zh-CN" w:bidi="ar-SA"/>
-              </w:rPr>
-            </w:pPr>
-            <w:r>
-              <w:rPr>
-                <w:rFonts w:eastAsia="Times New Roman" w:cs="Times New Roman" w:ascii="Times New Roman" w:hAnsi="Times New Roman"/>
+                <w:rFonts w:ascii="Liberation Sans" w:hAnsi="Liberation Sans"/>
+              </w:rPr>
+            </w:pPr>
+            <w:r>
+              <w:rPr>
+                <w:rFonts w:eastAsia="Times New Roman" w:cs="Times New Roman" w:ascii="Liberation Sans" w:hAnsi="Liberation Sans"/>
                 <w:b/>
                 <w:color w:val="auto"/>
                 <w:sz w:val="18"/>
@@ -1216,16 +1156,15 @@
               <w:snapToGrid w:val="false"/>
               <w:spacing w:lineRule="auto" w:line="240" w:before="0" w:after="0"/>
               <w:rPr>
-                <w:rFonts w:ascii="Arial" w:hAnsi="Arial" w:cs="Arial"/>
-                <w:b/>
-                <w:b/>
-                <w:sz w:val="18"/>
-                <w:szCs w:val="18"/>
-              </w:rPr>
-            </w:pPr>
-            <w:r>
-              <w:rPr>
-                <w:rFonts w:cs="Arial" w:ascii="Arial" w:hAnsi="Arial"/>
+                <w:rFonts w:ascii="Liberation Sans" w:hAnsi="Liberation Sans" w:cs="Arial"/>
+                <w:b/>
+                <w:sz w:val="18"/>
+                <w:szCs w:val="18"/>
+              </w:rPr>
+            </w:pPr>
+            <w:r>
+              <w:rPr>
+                <w:rFonts w:cs="Arial" w:ascii="Liberation Sans" w:hAnsi="Liberation Sans"/>
                 <w:b/>
                 <w:sz w:val="18"/>
                 <w:szCs w:val="18"/>
@@ -1238,14 +1177,12 @@
               <w:widowControl w:val="false"/>
               <w:spacing w:lineRule="auto" w:line="240" w:before="0" w:after="0"/>
               <w:rPr>
-                <w:rFonts w:ascii="Arial" w:hAnsi="Arial" w:cs="Arial"/>
-                <w:sz w:val="18"/>
-                <w:szCs w:val="18"/>
-              </w:rPr>
-            </w:pPr>
-            <w:r>
-              <w:rPr>
-                <w:rFonts w:cs="Arial" w:ascii="Arial" w:hAnsi="Arial"/>
+                <w:rFonts w:ascii="Liberation Sans" w:hAnsi="Liberation Sans"/>
+              </w:rPr>
+            </w:pPr>
+            <w:r>
+              <w:rPr>
+                <w:rFonts w:cs="Arial" w:ascii="Liberation Sans" w:hAnsi="Liberation Sans"/>
                 <w:sz w:val="18"/>
                 <w:szCs w:val="18"/>
               </w:rPr>
@@ -1270,18 +1207,12 @@
               <w:widowControl w:val="false"/>
               <w:spacing w:before="0" w:after="0"/>
               <w:rPr>
-                <w:rFonts w:ascii="Times New Roman" w:hAnsi="Times New Roman" w:eastAsia="Times New Roman" w:cs="Times New Roman"/>
-                <w:b/>
-                <w:b/>
-                <w:color w:val="auto"/>
-                <w:sz w:val="18"/>
-                <w:szCs w:val="18"/>
-                <w:lang w:val="en-US" w:eastAsia="zh-CN" w:bidi="ar-SA"/>
-              </w:rPr>
-            </w:pPr>
-            <w:r>
-              <w:rPr>
-                <w:rFonts w:eastAsia="Times New Roman" w:cs="Times New Roman" w:ascii="Times New Roman" w:hAnsi="Times New Roman"/>
+                <w:rFonts w:ascii="Liberation Sans" w:hAnsi="Liberation Sans"/>
+              </w:rPr>
+            </w:pPr>
+            <w:r>
+              <w:rPr>
+                <w:rFonts w:eastAsia="Times New Roman" w:cs="Times New Roman" w:ascii="Liberation Sans" w:hAnsi="Liberation Sans"/>
                 <w:b/>
                 <w:color w:val="auto"/>
                 <w:sz w:val="18"/>
@@ -1299,7 +1230,7 @@
         <w:pStyle w:val="Normal"/>
         <w:spacing w:before="0" w:after="0"/>
         <w:rPr>
-          <w:rFonts w:ascii="Arial" w:hAnsi="Arial" w:cs="Arial"/>
+          <w:rFonts w:ascii="Liberation Sans" w:hAnsi="Liberation Sans" w:cs="Arial"/>
           <w:sz w:val="18"/>
           <w:szCs w:val="18"/>
           <w:u w:val="single"/>
@@ -1307,7 +1238,7 @@
       </w:pPr>
       <w:r>
         <w:rPr>
-          <w:rFonts w:cs="Arial" w:ascii="Arial" w:hAnsi="Arial"/>
+          <w:rFonts w:cs="Arial" w:ascii="Liberation Sans" w:hAnsi="Liberation Sans"/>
           <w:sz w:val="18"/>
           <w:szCs w:val="18"/>
           <w:u w:val="single"/>
@@ -1319,14 +1250,12 @@
         <w:pStyle w:val="Normal"/>
         <w:spacing w:before="0" w:after="0"/>
         <w:rPr>
-          <w:rFonts w:ascii="Arial" w:hAnsi="Arial" w:cs="Arial"/>
-          <w:sz w:val="16"/>
-          <w:szCs w:val="16"/>
+          <w:rFonts w:ascii="Liberation Sans" w:hAnsi="Liberation Sans"/>
         </w:rPr>
       </w:pPr>
       <w:r>
         <w:rPr>
-          <w:rFonts w:cs="Arial" w:ascii="Arial" w:hAnsi="Arial"/>
+          <w:rFonts w:cs="Arial" w:ascii="Liberation Sans" w:hAnsi="Liberation Sans"/>
           <w:sz w:val="16"/>
           <w:szCs w:val="16"/>
         </w:rPr>
@@ -1338,14 +1267,12 @@
         <w:pStyle w:val="Normal"/>
         <w:spacing w:before="0" w:after="0"/>
         <w:rPr>
-          <w:rFonts w:ascii="Arial" w:hAnsi="Arial" w:cs="Arial"/>
-          <w:sz w:val="16"/>
-          <w:szCs w:val="16"/>
+          <w:rFonts w:ascii="Liberation Sans" w:hAnsi="Liberation Sans"/>
         </w:rPr>
       </w:pPr>
       <w:r>
         <w:rPr>
-          <w:rFonts w:cs="Arial" w:ascii="Arial" w:hAnsi="Arial"/>
+          <w:rFonts w:cs="Arial" w:ascii="Liberation Sans" w:hAnsi="Liberation Sans"/>
           <w:sz w:val="16"/>
           <w:szCs w:val="16"/>
         </w:rPr>
@@ -1357,14 +1284,12 @@
         <w:pStyle w:val="Normal"/>
         <w:spacing w:before="0" w:after="0"/>
         <w:rPr>
-          <w:rFonts w:ascii="Arial" w:hAnsi="Arial" w:cs="Arial"/>
-          <w:sz w:val="16"/>
-          <w:szCs w:val="16"/>
+          <w:rFonts w:ascii="Liberation Sans" w:hAnsi="Liberation Sans"/>
         </w:rPr>
       </w:pPr>
       <w:r>
         <w:rPr>
-          <w:rFonts w:cs="Arial" w:ascii="Arial" w:hAnsi="Arial"/>
+          <w:rFonts w:cs="Arial" w:ascii="Liberation Sans" w:hAnsi="Liberation Sans"/>
           <w:sz w:val="16"/>
           <w:szCs w:val="16"/>
         </w:rPr>
@@ -1376,14 +1301,12 @@
         <w:pStyle w:val="Normal"/>
         <w:spacing w:before="0" w:after="0"/>
         <w:rPr>
-          <w:rFonts w:ascii="Arial" w:hAnsi="Arial" w:cs="Arial"/>
-          <w:sz w:val="16"/>
-          <w:szCs w:val="16"/>
+          <w:rFonts w:ascii="Liberation Sans" w:hAnsi="Liberation Sans"/>
         </w:rPr>
       </w:pPr>
       <w:r>
         <w:rPr>
-          <w:rFonts w:cs="Arial" w:ascii="Arial" w:hAnsi="Arial"/>
+          <w:rFonts w:cs="Arial" w:ascii="Liberation Sans" w:hAnsi="Liberation Sans"/>
           <w:sz w:val="16"/>
           <w:szCs w:val="16"/>
         </w:rPr>
@@ -1394,11 +1317,13 @@
       <w:pPr>
         <w:pStyle w:val="Normal"/>
         <w:spacing w:before="0" w:after="0"/>
-        <w:rPr/>
+        <w:rPr>
+          <w:rFonts w:ascii="Liberation Sans" w:hAnsi="Liberation Sans"/>
+        </w:rPr>
       </w:pPr>
       <w:r>
         <w:rPr>
-          <w:rFonts w:cs="Arial" w:ascii="Arial" w:hAnsi="Arial"/>
+          <w:rFonts w:cs="Arial" w:ascii="Liberation Sans" w:hAnsi="Liberation Sans"/>
           <w:sz w:val="16"/>
           <w:szCs w:val="16"/>
         </w:rPr>
@@ -1406,7 +1331,7 @@
       </w:r>
       <w:r>
         <w:rPr>
-          <w:rFonts w:cs="Arial" w:ascii="Arial" w:hAnsi="Arial"/>
+          <w:rFonts w:cs="Arial" w:ascii="Liberation Sans" w:hAnsi="Liberation Sans"/>
           <w:b/>
           <w:sz w:val="16"/>
           <w:szCs w:val="16"/>
@@ -1415,7 +1340,7 @@
       </w:r>
       <w:r>
         <w:rPr>
-          <w:rFonts w:cs="Arial" w:ascii="Arial" w:hAnsi="Arial"/>
+          <w:rFonts w:cs="Arial" w:ascii="Liberation Sans" w:hAnsi="Liberation Sans"/>
           <w:sz w:val="16"/>
           <w:szCs w:val="16"/>
         </w:rPr>
@@ -1427,14 +1352,14 @@
         <w:pStyle w:val="Normal"/>
         <w:spacing w:before="0" w:after="0"/>
         <w:rPr>
-          <w:rFonts w:ascii="Arial" w:hAnsi="Arial" w:cs="Arial"/>
+          <w:rFonts w:ascii="Liberation Sans" w:hAnsi="Liberation Sans" w:cs="Arial"/>
           <w:sz w:val="18"/>
           <w:szCs w:val="18"/>
         </w:rPr>
       </w:pPr>
       <w:r>
         <w:rPr>
-          <w:rFonts w:cs="Arial" w:ascii="Arial" w:hAnsi="Arial"/>
+          <w:rFonts w:cs="Arial" w:ascii="Liberation Sans" w:hAnsi="Liberation Sans"/>
           <w:sz w:val="18"/>
           <w:szCs w:val="18"/>
         </w:rPr>
@@ -1442,46 +1367,40 @@
     </w:p>
     <w:p>
       <w:pPr>
-        <w:pStyle w:val="Style22"/>
+        <w:pStyle w:val="Style18"/>
         <w:bidi w:val="0"/>
         <w:jc w:val="left"/>
         <w:rPr>
-          <w:rFonts w:ascii="Arial" w:hAnsi="Arial" w:cs="Arial"/>
-          <w:b/>
+          <w:rFonts w:ascii="Liberation Sans" w:hAnsi="Liberation Sans"/>
+        </w:rPr>
+      </w:pPr>
+      <w:r>
+        <w:rPr>
+          <w:rFonts w:cs="Arial" w:ascii="Liberation Sans" w:hAnsi="Liberation Sans"/>
           <w:b/>
           <w:sz w:val="20"/>
           <w:szCs w:val="20"/>
           <w:u w:val="single"/>
         </w:rPr>
-      </w:pPr>
-      <w:r>
-        <w:rPr>
-          <w:rFonts w:cs="Arial" w:ascii="Arial" w:hAnsi="Arial"/>
+        <w:t>Реквизиты сторон:</w:t>
+      </w:r>
+    </w:p>
+    <w:p>
+      <w:pPr>
+        <w:pStyle w:val="Style18"/>
+        <w:bidi w:val="0"/>
+        <w:jc w:val="left"/>
+        <w:rPr>
+          <w:rFonts w:ascii="Liberation Sans" w:hAnsi="Liberation Sans" w:cs="Arial"/>
           <w:b/>
           <w:sz w:val="20"/>
           <w:szCs w:val="20"/>
           <w:u w:val="single"/>
         </w:rPr>
-        <w:t>Реквизиты сторон:</w:t>
-      </w:r>
-    </w:p>
-    <w:p>
-      <w:pPr>
-        <w:pStyle w:val="Style22"/>
-        <w:bidi w:val="0"/>
-        <w:jc w:val="left"/>
-        <w:rPr>
-          <w:rFonts w:ascii="Arial" w:hAnsi="Arial" w:cs="Arial"/>
-          <w:b/>
-          <w:b/>
-          <w:sz w:val="20"/>
-          <w:szCs w:val="20"/>
-          <w:u w:val="single"/>
-        </w:rPr>
       </w:pPr>
       <w:r>
         <w:rPr>
-          <w:rFonts w:cs="Arial" w:ascii="Arial" w:hAnsi="Arial"/>
+          <w:rFonts w:cs="Arial" w:ascii="Liberation Sans" w:hAnsi="Liberation Sans"/>
           <w:b/>
           <w:sz w:val="20"/>
           <w:szCs w:val="20"/>
@@ -1520,15 +1439,14 @@
               <w:snapToGrid w:val="false"/>
               <w:spacing w:lineRule="auto" w:line="240"/>
               <w:rPr>
-                <w:rFonts w:ascii="Times New Roman" w:hAnsi="Times New Roman" w:cs="Times New Roman"/>
-                <w:b/>
+                <w:rFonts w:ascii="Liberation Sans" w:hAnsi="Liberation Sans" w:cs="Times New Roman"/>
                 <w:b/>
                 <w:bCs/>
               </w:rPr>
             </w:pPr>
             <w:r>
               <w:rPr>
-                <w:rFonts w:cs="Times New Roman" w:ascii="Times New Roman" w:hAnsi="Times New Roman"/>
+                <w:rFonts w:cs="Times New Roman" w:ascii="Liberation Sans" w:hAnsi="Liberation Sans"/>
                 <w:b/>
                 <w:bCs/>
               </w:rPr>
@@ -1540,8 +1458,12 @@
               <w:widowControl w:val="false"/>
               <w:spacing w:lineRule="auto" w:line="240"/>
               <w:rPr>
-                <w:rFonts w:ascii="Times New Roman" w:hAnsi="Times New Roman" w:eastAsia="Times New Roman" w:cs="Times New Roman"/>
-                <w:b/>
+                <w:rFonts w:ascii="Liberation Sans" w:hAnsi="Liberation Sans"/>
+              </w:rPr>
+            </w:pPr>
+            <w:r>
+              <w:rPr>
+                <w:rFonts w:eastAsia="Times New Roman" w:cs="Times New Roman" w:ascii="Liberation Sans" w:hAnsi="Liberation Sans"/>
                 <w:b/>
                 <w:bCs/>
                 <w:color w:val="auto"/>
@@ -1549,17 +1471,6 @@
                 <w:szCs w:val="22"/>
                 <w:lang w:val="en-US" w:eastAsia="zh-CN" w:bidi="ar-SA"/>
               </w:rPr>
-            </w:pPr>
-            <w:r>
-              <w:rPr>
-                <w:rFonts w:eastAsia="Times New Roman" w:cs="Times New Roman" w:ascii="Times New Roman" w:hAnsi="Times New Roman"/>
-                <w:b/>
-                <w:bCs/>
-                <w:color w:val="auto"/>
-                <w:sz w:val="22"/>
-                <w:szCs w:val="22"/>
-                <w:lang w:val="en-US" w:eastAsia="zh-CN" w:bidi="ar-SA"/>
-              </w:rPr>
               <w:t>{{ performer_info }}</w:t>
             </w:r>
           </w:p>
@@ -1570,8 +1481,7 @@
               <w:bidi w:val="0"/>
               <w:jc w:val="left"/>
               <w:rPr>
-                <w:rFonts w:ascii="Times New Roman" w:hAnsi="Times New Roman" w:cs="Times New Roman"/>
-                <w:b/>
+                <w:rFonts w:ascii="Liberation Sans" w:hAnsi="Liberation Sans" w:cs="Times New Roman"/>
                 <w:b/>
                 <w:color w:val="000000"/>
                 <w:sz w:val="16"/>
@@ -1580,7 +1490,7 @@
             </w:pPr>
             <w:r>
               <w:rPr>
-                <w:rFonts w:cs="Times New Roman" w:ascii="Times New Roman" w:hAnsi="Times New Roman"/>
+                <w:rFonts w:cs="Times New Roman" w:ascii="Liberation Sans" w:hAnsi="Liberation Sans"/>
                 <w:b/>
                 <w:color w:val="000000"/>
                 <w:sz w:val="16"/>
@@ -1595,8 +1505,7 @@
               <w:bidi w:val="0"/>
               <w:jc w:val="left"/>
               <w:rPr>
-                <w:rFonts w:ascii="Times New Roman" w:hAnsi="Times New Roman" w:cs="Times New Roman"/>
-                <w:b/>
+                <w:rFonts w:ascii="Liberation Sans" w:hAnsi="Liberation Sans" w:cs="Times New Roman"/>
                 <w:b/>
                 <w:color w:val="000000"/>
                 <w:sz w:val="16"/>
@@ -1605,7 +1514,7 @@
             </w:pPr>
             <w:r>
               <w:rPr>
-                <w:rFonts w:cs="Times New Roman" w:ascii="Times New Roman" w:hAnsi="Times New Roman"/>
+                <w:rFonts w:cs="Times New Roman" w:ascii="Liberation Sans" w:hAnsi="Liberation Sans"/>
                 <w:b/>
                 <w:color w:val="000000"/>
                 <w:sz w:val="16"/>
@@ -1625,8 +1534,7 @@
               <w:widowControl w:val="false"/>
               <w:snapToGrid w:val="false"/>
               <w:rPr>
-                <w:rFonts w:ascii="Times New Roman" w:hAnsi="Times New Roman" w:cs="Times New Roman"/>
-                <w:b/>
+                <w:rFonts w:ascii="Liberation Sans" w:hAnsi="Liberation Sans" w:cs="Times New Roman"/>
                 <w:b/>
                 <w:color w:val="000000"/>
                 <w:sz w:val="20"/>
@@ -1635,7 +1543,7 @@
             </w:pPr>
             <w:r>
               <w:rPr>
-                <w:rFonts w:cs="Times New Roman" w:ascii="Times New Roman" w:hAnsi="Times New Roman"/>
+                <w:rFonts w:cs="Times New Roman" w:ascii="Liberation Sans" w:hAnsi="Liberation Sans"/>
                 <w:b/>
                 <w:color w:val="000000"/>
                 <w:sz w:val="20"/>
@@ -1645,26 +1553,16 @@
           </w:p>
           <w:p>
             <w:pPr>
-              <w:pStyle w:val="Style28"/>
+              <w:pStyle w:val="Style22"/>
               <w:widowControl w:val="false"/>
               <w:jc w:val="left"/>
               <w:rPr>
-                <w:rFonts w:ascii="Times New Roman" w:hAnsi="Times New Roman" w:eastAsia="Courier New" w:cs="Times New Roman"/>
-                <w:b/>
-                <w:b/>
-                <w:bCs/>
-                <w:i w:val="false"/>
-                <w:i w:val="false"/>
-                <w:iCs w:val="false"/>
-                <w:color w:val="auto"/>
-                <w:sz w:val="22"/>
-                <w:szCs w:val="22"/>
-                <w:lang w:val="en-US" w:eastAsia="zh-CN" w:bidi="ar-SA"/>
-              </w:rPr>
-            </w:pPr>
-            <w:r>
-              <w:rPr>
-                <w:rFonts w:eastAsia="Courier New" w:cs="Times New Roman" w:ascii="Times New Roman" w:hAnsi="Times New Roman"/>
+                <w:rFonts w:ascii="Liberation Sans" w:hAnsi="Liberation Sans"/>
+              </w:rPr>
+            </w:pPr>
+            <w:r>
+              <w:rPr>
+                <w:rFonts w:eastAsia="Courier New" w:cs="Times New Roman" w:ascii="Liberation Sans" w:hAnsi="Liberation Sans"/>
                 <w:b/>
                 <w:bCs/>
                 <w:i w:val="false"/>
@@ -1692,14 +1590,13 @@
           </w:tcPr>
           <w:p>
             <w:pPr>
-              <w:pStyle w:val="Style22"/>
+              <w:pStyle w:val="Style18"/>
               <w:widowControl w:val="false"/>
               <w:bidi w:val="0"/>
               <w:snapToGrid w:val="false"/>
               <w:jc w:val="left"/>
               <w:rPr>
-                <w:rFonts w:ascii="Arial" w:hAnsi="Arial" w:cs="Arial"/>
-                <w:b/>
+                <w:rFonts w:ascii="Liberation Sans" w:hAnsi="Liberation Sans" w:cs="Arial"/>
                 <w:b/>
                 <w:sz w:val="16"/>
                 <w:szCs w:val="16"/>
@@ -1707,7 +1604,7 @@
             </w:pPr>
             <w:r>
               <w:rPr>
-                <w:rFonts w:cs="Arial" w:ascii="Arial" w:hAnsi="Arial"/>
+                <w:rFonts w:cs="Arial" w:ascii="Liberation Sans" w:hAnsi="Liberation Sans"/>
                 <w:b/>
                 <w:sz w:val="16"/>
                 <w:szCs w:val="16"/>
@@ -1731,8 +1628,7 @@
               <w:snapToGrid w:val="false"/>
               <w:spacing w:before="0" w:after="200"/>
               <w:rPr>
-                <w:rFonts w:ascii="Arial" w:hAnsi="Arial" w:cs="Arial"/>
-                <w:b/>
+                <w:rFonts w:ascii="Liberation Sans" w:hAnsi="Liberation Sans" w:cs="Arial"/>
                 <w:b/>
                 <w:sz w:val="20"/>
                 <w:szCs w:val="20"/>
@@ -1740,7 +1636,7 @@
             </w:pPr>
             <w:r>
               <w:rPr>
-                <w:rFonts w:cs="Arial" w:ascii="Arial" w:hAnsi="Arial"/>
+                <w:rFonts w:cs="Arial" w:ascii="Liberation Sans" w:hAnsi="Liberation Sans"/>
                 <w:b/>
                 <w:sz w:val="20"/>
                 <w:szCs w:val="20"/>
@@ -1752,20 +1648,18 @@
     </w:tbl>
     <w:p>
       <w:pPr>
-        <w:pStyle w:val="Style22"/>
+        <w:pStyle w:val="Style18"/>
         <w:bidi w:val="0"/>
         <w:jc w:val="left"/>
         <w:rPr>
-          <w:rFonts w:ascii="Arial" w:hAnsi="Arial" w:cs="Arial"/>
-          <w:sz w:val="20"/>
-          <w:szCs w:val="20"/>
+          <w:rFonts w:ascii="Liberation Sans" w:hAnsi="Liberation Sans"/>
         </w:rPr>
       </w:pPr>
       <w:r>
         <mc:AlternateContent>
           <mc:Choice Requires="wps">
             <w:drawing>
-              <wp:anchor behindDoc="1" distT="0" distB="0" distL="0" distR="0" simplePos="0" locked="0" layoutInCell="0" allowOverlap="1" relativeHeight="4">
+              <wp:anchor behindDoc="1" distT="5080" distB="5080" distL="5715" distR="4445" simplePos="0" locked="0" layoutInCell="1" allowOverlap="1" relativeHeight="2">
                 <wp:simplePos x="0" y="0"/>
                 <wp:positionH relativeFrom="column">
                   <wp:posOffset>316230</wp:posOffset>
@@ -1774,7 +1668,7 @@
                   <wp:posOffset>115570</wp:posOffset>
                 </wp:positionV>
                 <wp:extent cx="6263005" cy="233680"/>
-                <wp:effectExtent l="0" t="0" r="0" b="0"/>
+                <wp:effectExtent l="5715" t="5080" r="4445" b="5080"/>
                 <wp:wrapNone/>
                 <wp:docPr id="1" name="Изображение1"/>
                 <a:graphic xmlns:a="http://schemas.openxmlformats.org/drawingml/2006/main">
@@ -1784,7 +1678,7 @@
                       <wps:spPr>
                         <a:xfrm>
                           <a:off x="0" y="0"/>
-                          <a:ext cx="6262200" cy="232920"/>
+                          <a:ext cx="6262920" cy="233640"/>
                         </a:xfrm>
                         <a:prstGeom prst="rect">
                           <a:avLst/>
@@ -1814,10 +1708,10 @@
           </mc:Choice>
           <mc:Fallback>
             <w:pict>
-              <v:rect id="shape_0" ID="Изображение1" fillcolor="white" stroked="t" style="position:absolute;margin-left:24.9pt;margin-top:9.1pt;width:493.05pt;height:18.3pt">
-                <w10:wrap type="none"/>
+              <v:rect id="shape_0" ID="Изображение1" path="m0,0l-2147483645,0l-2147483645,-2147483646l0,-2147483646xe" fillcolor="white" stroked="t" o:allowincell="f" style="position:absolute;margin-left:24.9pt;margin-top:9.1pt;width:493.1pt;height:18.35pt;mso-wrap-style:none;v-text-anchor:middle">
                 <v:fill o:detectmouseclick="t" type="solid" color2="black"/>
                 <v:stroke color="white" weight="9360" joinstyle="miter" endcap="square"/>
+                <w10:wrap type="none"/>
               </v:rect>
             </w:pict>
           </mc:Fallback>
@@ -1825,7 +1719,7 @@
       </w:r>
       <w:r>
         <w:rPr>
-          <w:rFonts w:cs="Arial" w:ascii="Arial" w:hAnsi="Arial"/>
+          <w:rFonts w:cs="Arial" w:ascii="Liberation Sans" w:hAnsi="Liberation Sans"/>
           <w:sz w:val="20"/>
           <w:szCs w:val="20"/>
         </w:rPr>
@@ -1841,16 +1735,14 @@
       <w:pPr>
         <w:pStyle w:val="Normal"/>
         <w:spacing w:before="0" w:after="0"/>
-        <w:ind w:left="0" w:right="0" w:firstLine="708"/>
-        <w:rPr>
-          <w:rFonts w:ascii="Arial" w:hAnsi="Arial" w:cs="Arial"/>
-          <w:sz w:val="20"/>
-          <w:szCs w:val="20"/>
+        <w:ind w:firstLine="708" w:left="0" w:right="0"/>
+        <w:rPr>
+          <w:rFonts w:ascii="Liberation Sans" w:hAnsi="Liberation Sans"/>
         </w:rPr>
       </w:pPr>
       <w:r>
         <w:rPr>
-          <w:rFonts w:cs="Arial" w:ascii="Arial" w:hAnsi="Arial"/>
+          <w:rFonts w:cs="Arial" w:ascii="Liberation Sans" w:hAnsi="Liberation Sans"/>
           <w:sz w:val="20"/>
           <w:szCs w:val="20"/>
         </w:rPr>
@@ -1869,13 +1761,15 @@
       <w:pPr>
         <w:pStyle w:val="Normal"/>
         <w:spacing w:before="0" w:after="0"/>
-        <w:rPr/>
+        <w:rPr>
+          <w:rFonts w:ascii="Liberation Sans" w:hAnsi="Liberation Sans"/>
+        </w:rPr>
       </w:pPr>
       <w:r>
         <mc:AlternateContent>
           <mc:Choice Requires="wps">
             <w:drawing>
-              <wp:anchor behindDoc="0" distT="0" distB="0" distL="0" distR="0" simplePos="0" locked="0" layoutInCell="0" allowOverlap="1" relativeHeight="2">
+              <wp:anchor behindDoc="0" distT="5715" distB="4445" distL="5715" distR="4445" simplePos="0" locked="0" layoutInCell="1" allowOverlap="1" relativeHeight="3">
                 <wp:simplePos x="0" y="0"/>
                 <wp:positionH relativeFrom="column">
                   <wp:posOffset>40005</wp:posOffset>
@@ -1884,7 +1778,7 @@
                   <wp:posOffset>1400810</wp:posOffset>
                 </wp:positionV>
                 <wp:extent cx="6739255" cy="281305"/>
-                <wp:effectExtent l="0" t="0" r="0" b="0"/>
+                <wp:effectExtent l="5715" t="5715" r="4445" b="4445"/>
                 <wp:wrapNone/>
                 <wp:docPr id="2" name="Изображение2"/>
                 <a:graphic xmlns:a="http://schemas.openxmlformats.org/drawingml/2006/main">
@@ -1894,7 +1788,7 @@
                       <wps:spPr>
                         <a:xfrm>
                           <a:off x="0" y="0"/>
-                          <a:ext cx="6738480" cy="280800"/>
+                          <a:ext cx="6739200" cy="281160"/>
                         </a:xfrm>
                         <a:prstGeom prst="rect">
                           <a:avLst/>
@@ -1924,10 +1818,10 @@
           </mc:Choice>
           <mc:Fallback>
             <w:pict>
-              <v:rect id="shape_0" ID="Изображение2" fillcolor="white" stroked="t" style="position:absolute;margin-left:3.15pt;margin-top:110.3pt;width:530.55pt;height:22.05pt">
-                <w10:wrap type="none"/>
+              <v:rect id="shape_0" ID="Изображение2" path="m0,0l-2147483645,0l-2147483645,-2147483646l0,-2147483646xe" fillcolor="white" stroked="t" o:allowincell="f" style="position:absolute;margin-left:3.15pt;margin-top:110.3pt;width:530.6pt;height:22.1pt;mso-wrap-style:none;v-text-anchor:middle">
                 <v:fill o:detectmouseclick="t" type="solid" color2="black"/>
                 <v:stroke color="white" weight="9360" joinstyle="miter" endcap="square"/>
+                <w10:wrap type="none"/>
               </v:rect>
             </w:pict>
           </mc:Fallback>
@@ -1935,7 +1829,7 @@
         <mc:AlternateContent>
           <mc:Choice Requires="wps">
             <w:drawing>
-              <wp:anchor behindDoc="0" distT="0" distB="0" distL="0" distR="0" simplePos="0" locked="0" layoutInCell="0" allowOverlap="1" relativeHeight="3">
+              <wp:anchor behindDoc="0" distT="5080" distB="5080" distL="5715" distR="4445" simplePos="0" locked="0" layoutInCell="1" allowOverlap="1" relativeHeight="4">
                 <wp:simplePos x="0" y="0"/>
                 <wp:positionH relativeFrom="column">
                   <wp:posOffset>144780</wp:posOffset>
@@ -1944,7 +1838,7 @@
                   <wp:posOffset>636270</wp:posOffset>
                 </wp:positionV>
                 <wp:extent cx="6853555" cy="405130"/>
-                <wp:effectExtent l="0" t="0" r="0" b="0"/>
+                <wp:effectExtent l="5715" t="5080" r="4445" b="5080"/>
                 <wp:wrapNone/>
                 <wp:docPr id="3" name="Изображение3"/>
                 <a:graphic xmlns:a="http://schemas.openxmlformats.org/drawingml/2006/main">
@@ -1954,7 +1848,7 @@
                       <wps:spPr>
                         <a:xfrm>
                           <a:off x="0" y="0"/>
-                          <a:ext cx="6852960" cy="404640"/>
+                          <a:ext cx="6853680" cy="405000"/>
                         </a:xfrm>
                         <a:prstGeom prst="rect">
                           <a:avLst/>
@@ -1984,10 +1878,10 @@
           </mc:Choice>
           <mc:Fallback>
             <w:pict>
-              <v:rect id="shape_0" ID="Изображение3" fillcolor="white" stroked="t" style="position:absolute;margin-left:11.4pt;margin-top:50.1pt;width:539.55pt;height:31.8pt">
-                <w10:wrap type="none"/>
+              <v:rect id="shape_0" ID="Изображение3" path="m0,0l-2147483645,0l-2147483645,-2147483646l0,-2147483646xe" fillcolor="white" stroked="t" o:allowincell="f" style="position:absolute;margin-left:11.4pt;margin-top:50.1pt;width:539.6pt;height:31.85pt;mso-wrap-style:none;v-text-anchor:middle">
                 <v:fill o:detectmouseclick="t" type="solid" color2="black"/>
                 <v:stroke color="white" weight="9360" joinstyle="miter" endcap="square"/>
+                <w10:wrap type="none"/>
               </v:rect>
             </w:pict>
           </mc:Fallback>
@@ -1995,7 +1889,7 @@
       </w:r>
       <w:r>
         <w:rPr>
-          <w:rFonts w:cs="Arial" w:ascii="Arial" w:hAnsi="Arial"/>
+          <w:rFonts w:cs="Arial" w:ascii="Liberation Sans" w:hAnsi="Liberation Sans"/>
           <w:b/>
           <w:sz w:val="20"/>
           <w:szCs w:val="20"/>
@@ -2007,7 +1901,7 @@
       </w:r>
       <w:r>
         <w:rPr>
-          <w:rFonts w:cs="Arial" w:ascii="Arial" w:hAnsi="Arial"/>
+          <w:rFonts w:cs="Arial" w:ascii="Liberation Sans" w:hAnsi="Liberation Sans"/>
           <w:b/>
           <w:sz w:val="20"/>
           <w:szCs w:val="20"/>
@@ -2016,7 +1910,7 @@
       </w:r>
       <w:r>
         <w:rPr>
-          <w:rFonts w:cs="Arial" w:ascii="Arial" w:hAnsi="Arial"/>
+          <w:rFonts w:cs="Arial" w:ascii="Liberation Sans" w:hAnsi="Liberation Sans"/>
           <w:b/>
           <w:sz w:val="20"/>
           <w:szCs w:val="20"/>
@@ -2026,7 +1920,7 @@
       </w:r>
       <w:r>
         <w:rPr>
-          <w:rFonts w:cs="Arial" w:ascii="Arial" w:hAnsi="Arial"/>
+          <w:rFonts w:cs="Arial" w:ascii="Liberation Sans" w:hAnsi="Liberation Sans"/>
           <w:b/>
           <w:sz w:val="20"/>
           <w:szCs w:val="20"/>
@@ -2040,7 +1934,7 @@
       </w:r>
       <w:r>
         <w:rPr>
-          <w:rFonts w:cs="Arial" w:ascii="Arial" w:hAnsi="Arial"/>
+          <w:rFonts w:cs="Arial" w:ascii="Liberation Sans" w:hAnsi="Liberation Sans"/>
           <w:b/>
           <w:sz w:val="20"/>
           <w:szCs w:val="20"/>
@@ -2052,7 +1946,7 @@
       </w:r>
       <w:r>
         <w:rPr>
-          <w:rFonts w:cs="Arial" w:ascii="Arial" w:hAnsi="Arial"/>
+          <w:rFonts w:cs="Arial" w:ascii="Liberation Sans" w:hAnsi="Liberation Sans"/>
           <w:b/>
           <w:sz w:val="20"/>
           <w:szCs w:val="20"/>
@@ -2061,7 +1955,7 @@
       </w:r>
       <w:r>
         <w:rPr>
-          <w:rFonts w:cs="Arial" w:ascii="Arial" w:hAnsi="Arial"/>
+          <w:rFonts w:cs="Arial" w:ascii="Liberation Sans" w:hAnsi="Liberation Sans"/>
           <w:b/>
           <w:sz w:val="20"/>
           <w:szCs w:val="20"/>
@@ -2071,7 +1965,7 @@
       </w:r>
       <w:r>
         <w:rPr>
-          <w:rFonts w:cs="Arial" w:ascii="Arial" w:hAnsi="Arial"/>
+          <w:rFonts w:cs="Arial" w:ascii="Liberation Sans" w:hAnsi="Liberation Sans"/>
           <w:b/>
           <w:sz w:val="20"/>
           <w:szCs w:val="20"/>
@@ -2080,7 +1974,7 @@
       </w:r>
       <w:r>
         <w:rPr>
-          <w:rFonts w:cs="Arial" w:ascii="Arial" w:hAnsi="Arial"/>
+          <w:rFonts w:cs="Arial" w:ascii="Liberation Sans" w:hAnsi="Liberation Sans"/>
           <w:sz w:val="20"/>
           <w:szCs w:val="20"/>
         </w:rPr>
@@ -2105,20 +1999,25 @@
         <w:pStyle w:val="Normal"/>
         <w:spacing w:before="0" w:after="0"/>
         <w:rPr>
-          <w:rFonts w:ascii="Arial" w:hAnsi="Arial" w:cs="Arial"/>
+          <w:rFonts w:ascii="Liberation Sans" w:hAnsi="Liberation Sans" w:cs="Arial"/>
           <w:sz w:val="20"/>
           <w:szCs w:val="20"/>
           <w:u w:val="single"/>
         </w:rPr>
       </w:pPr>
       <w:r>
-        <w:rPr/>
+        <w:rPr>
+          <w:rFonts w:cs="Arial" w:ascii="Liberation Sans" w:hAnsi="Liberation Sans"/>
+          <w:sz w:val="20"/>
+          <w:szCs w:val="20"/>
+          <w:u w:val="single"/>
+        </w:rPr>
       </w:r>
     </w:p>
     <w:sectPr>
       <w:type w:val="nextPage"/>
       <w:pgSz w:w="11906" w:h="16838"/>
-      <w:pgMar w:left="567" w:right="567" w:header="0" w:top="567" w:footer="0" w:bottom="567" w:gutter="0"/>
+      <w:pgMar w:left="567" w:right="567" w:gutter="0" w:header="0" w:top="567" w:footer="0" w:bottom="567"/>
       <w:pgNumType w:fmt="decimal"/>
       <w:formProt w:val="false"/>
       <w:textDirection w:val="lrTb"/>
@@ -2169,14 +2068,15 @@
     <w:qFormat/>
     <w:rPr/>
   </w:style>
-  <w:style w:type="character" w:styleId="Style15">
+  <w:style w:type="character" w:styleId="-">
     <w:name w:val="Интернет-ссылка"/>
+    <w:qFormat/>
     <w:rPr>
       <w:color w:val="0000FF"/>
       <w:u w:val="single"/>
     </w:rPr>
   </w:style>
-  <w:style w:type="character" w:styleId="Style16">
+  <w:style w:type="character" w:styleId="Style15">
     <w:name w:val="Выделение"/>
     <w:basedOn w:val="Style14"/>
     <w:qFormat/>
@@ -2185,40 +2085,40 @@
       <w:iCs/>
     </w:rPr>
   </w:style>
-  <w:style w:type="character" w:styleId="Wmicallto">
+  <w:style w:type="character" w:styleId="wmi-callto">
     <w:name w:val="wmi-callto"/>
     <w:basedOn w:val="Style14"/>
     <w:qFormat/>
     <w:rPr/>
   </w:style>
-  <w:style w:type="character" w:styleId="Jsextractedaddress">
+  <w:style w:type="character" w:styleId="js-extracted-address">
     <w:name w:val="js-extracted-address"/>
     <w:basedOn w:val="Style14"/>
     <w:qFormat/>
     <w:rPr/>
   </w:style>
-  <w:style w:type="character" w:styleId="Mailmessagemapnobreak">
+  <w:style w:type="character" w:styleId="mail-message-map-nobreak">
     <w:name w:val="mail-message-map-nobreak"/>
     <w:basedOn w:val="Style14"/>
     <w:qFormat/>
     <w:rPr/>
   </w:style>
-  <w:style w:type="paragraph" w:styleId="Style17">
-    <w:name w:val="Заголовок"/>
+  <w:style w:type="paragraph" w:styleId="Heading">
+    <w:name w:val="Heading"/>
     <w:basedOn w:val="Normal"/>
-    <w:next w:val="Style18"/>
+    <w:next w:val="BodyText"/>
     <w:qFormat/>
     <w:pPr>
       <w:keepNext w:val="true"/>
       <w:spacing w:before="240" w:after="120"/>
     </w:pPr>
     <w:rPr>
-      <w:rFonts w:ascii="Liberation Sans;Arial" w:hAnsi="Liberation Sans;Arial" w:eastAsia="Noto Sans CJK SC" w:cs="Lohit Devanagari"/>
+      <w:rFonts w:ascii="Liberation Sans" w:hAnsi="Liberation Sans" w:eastAsia="Microsoft YaHei" w:cs="Arial"/>
       <w:sz w:val="28"/>
       <w:szCs w:val="28"/>
     </w:rPr>
   </w:style>
-  <w:style w:type="paragraph" w:styleId="Style18">
+  <w:style w:type="paragraph" w:styleId="BodyText">
     <w:name w:val="Body Text"/>
     <w:basedOn w:val="Normal"/>
     <w:pPr>
@@ -2226,16 +2126,16 @@
     </w:pPr>
     <w:rPr/>
   </w:style>
-  <w:style w:type="paragraph" w:styleId="Style19">
+  <w:style w:type="paragraph" w:styleId="List">
     <w:name w:val="List"/>
-    <w:basedOn w:val="Style18"/>
+    <w:basedOn w:val="BodyText"/>
     <w:pPr/>
     <w:rPr>
       <w:rFonts w:cs="Lohit Devanagari"/>
     </w:rPr>
   </w:style>
-  <w:style w:type="paragraph" w:styleId="Style20">
-    <w:name w:val="Caption"/>
+  <w:style w:type="paragraph" w:styleId="Caption">
+    <w:name w:val="caption"/>
     <w:basedOn w:val="Normal"/>
     <w:qFormat/>
     <w:pPr>
@@ -2250,7 +2150,33 @@
       <w:szCs w:val="24"/>
     </w:rPr>
   </w:style>
-  <w:style w:type="paragraph" w:styleId="Style21">
+  <w:style w:type="paragraph" w:styleId="Index">
+    <w:name w:val="Index"/>
+    <w:basedOn w:val="Normal"/>
+    <w:qFormat/>
+    <w:pPr>
+      <w:suppressLineNumbers/>
+    </w:pPr>
+    <w:rPr>
+      <w:rFonts w:cs="Arial"/>
+    </w:rPr>
+  </w:style>
+  <w:style w:type="paragraph" w:styleId="Style16">
+    <w:name w:val="Заголовок"/>
+    <w:basedOn w:val="Normal"/>
+    <w:next w:val="BodyText"/>
+    <w:qFormat/>
+    <w:pPr>
+      <w:keepNext w:val="true"/>
+      <w:spacing w:before="240" w:after="120"/>
+    </w:pPr>
+    <w:rPr>
+      <w:rFonts w:ascii="Liberation Sans;Arial" w:hAnsi="Liberation Sans;Arial" w:eastAsia="Noto Sans CJK SC" w:cs="Lohit Devanagari"/>
+      <w:sz w:val="28"/>
+      <w:szCs w:val="28"/>
+    </w:rPr>
+  </w:style>
+  <w:style w:type="paragraph" w:styleId="Style17">
     <w:name w:val="Указатель"/>
     <w:basedOn w:val="Normal"/>
     <w:qFormat/>
@@ -2261,7 +2187,7 @@
       <w:rFonts w:cs="Lohit Devanagari"/>
     </w:rPr>
   </w:style>
-  <w:style w:type="paragraph" w:styleId="Style22">
+  <w:style w:type="paragraph" w:styleId="Style18">
     <w:name w:val="Без интервала"/>
     <w:qFormat/>
     <w:pPr>
@@ -2299,7 +2225,7 @@
       <w:lang w:val="ru-RU" w:eastAsia="zh-CN" w:bidi="ar-SA"/>
     </w:rPr>
   </w:style>
-  <w:style w:type="paragraph" w:styleId="Style23">
+  <w:style w:type="paragraph" w:styleId="Style19">
     <w:name w:val="Верхний и нижний колонтитулы"/>
     <w:basedOn w:val="Normal"/>
     <w:qFormat/>
@@ -2313,8 +2239,15 @@
     </w:pPr>
     <w:rPr/>
   </w:style>
-  <w:style w:type="paragraph" w:styleId="Style24">
-    <w:name w:val="Header"/>
+  <w:style w:type="paragraph" w:styleId="HeaderandFooter">
+    <w:name w:val="Header and Footer"/>
+    <w:basedOn w:val="Normal"/>
+    <w:qFormat/>
+    <w:pPr/>
+    <w:rPr/>
+  </w:style>
+  <w:style w:type="paragraph" w:styleId="Header">
+    <w:name w:val="header"/>
     <w:basedOn w:val="Normal"/>
     <w:pPr>
       <w:tabs>
@@ -2325,8 +2258,8 @@
     </w:pPr>
     <w:rPr/>
   </w:style>
-  <w:style w:type="paragraph" w:styleId="Style25">
-    <w:name w:val="Footer"/>
+  <w:style w:type="paragraph" w:styleId="Footer">
+    <w:name w:val="footer"/>
     <w:basedOn w:val="Normal"/>
     <w:pPr>
       <w:tabs>
@@ -2337,7 +2270,7 @@
     </w:pPr>
     <w:rPr/>
   </w:style>
-  <w:style w:type="paragraph" w:styleId="Style26">
+  <w:style w:type="paragraph" w:styleId="Style20">
     <w:name w:val="Содержимое таблицы"/>
     <w:basedOn w:val="Normal"/>
     <w:qFormat/>
@@ -2346,9 +2279,9 @@
     </w:pPr>
     <w:rPr/>
   </w:style>
-  <w:style w:type="paragraph" w:styleId="Style27">
+  <w:style w:type="paragraph" w:styleId="Style21">
     <w:name w:val="Заголовок таблицы"/>
-    <w:basedOn w:val="Style26"/>
+    <w:basedOn w:val="Style20"/>
     <w:qFormat/>
     <w:pPr>
       <w:suppressLineNumbers/>
@@ -2359,7 +2292,7 @@
       <w:bCs/>
     </w:rPr>
   </w:style>
-  <w:style w:type="paragraph" w:styleId="Style28">
+  <w:style w:type="paragraph" w:styleId="Style22">
     <w:name w:val="Текст в заданном формате"/>
     <w:basedOn w:val="Normal"/>
     <w:qFormat/>
@@ -2373,4 +2306,110 @@
     </w:rPr>
   </w:style>
 </w:styles>
+</file>
+
+<file path=word/theme/theme1.xml><?xml version="1.0" encoding="utf-8"?>
+<a:theme xmlns:a="http://schemas.openxmlformats.org/drawingml/2006/main" xmlns:r="http://schemas.openxmlformats.org/officeDocument/2006/relationships" name="Office">
+  <a:themeElements>
+    <a:clrScheme name="LibreOffice">
+      <a:dk1>
+        <a:srgbClr val="000000"/>
+      </a:dk1>
+      <a:lt1>
+        <a:srgbClr val="ffffff"/>
+      </a:lt1>
+      <a:dk2>
+        <a:srgbClr val="000000"/>
+      </a:dk2>
+      <a:lt2>
+        <a:srgbClr val="ffffff"/>
+      </a:lt2>
+      <a:accent1>
+        <a:srgbClr val="18a303"/>
+      </a:accent1>
+      <a:accent2>
+        <a:srgbClr val="0369a3"/>
+      </a:accent2>
+      <a:accent3>
+        <a:srgbClr val="a33e03"/>
+      </a:accent3>
+      <a:accent4>
+        <a:srgbClr val="8e03a3"/>
+      </a:accent4>
+      <a:accent5>
+        <a:srgbClr val="c99c00"/>
+      </a:accent5>
+      <a:accent6>
+        <a:srgbClr val="c9211e"/>
+      </a:accent6>
+      <a:hlink>
+        <a:srgbClr val="0000ee"/>
+      </a:hlink>
+      <a:folHlink>
+        <a:srgbClr val="551a8b"/>
+      </a:folHlink>
+    </a:clrScheme>
+    <a:fontScheme name="Office">
+      <a:majorFont>
+        <a:latin typeface="Arial" pitchFamily="0" charset="1"/>
+        <a:ea typeface="DejaVu Sans" pitchFamily="0" charset="1"/>
+        <a:cs typeface="DejaVu Sans" pitchFamily="0" charset="1"/>
+      </a:majorFont>
+      <a:minorFont>
+        <a:latin typeface="Arial" pitchFamily="0" charset="1"/>
+        <a:ea typeface="DejaVu Sans" pitchFamily="0" charset="1"/>
+        <a:cs typeface="DejaVu Sans" pitchFamily="0" charset="1"/>
+      </a:minorFont>
+    </a:fontScheme>
+    <a:fmtScheme>
+      <a:fillStyleLst>
+        <a:solidFill>
+          <a:schemeClr val="phClr"/>
+        </a:solidFill>
+        <a:solidFill>
+          <a:schemeClr val="phClr"/>
+        </a:solidFill>
+        <a:solidFill>
+          <a:schemeClr val="phClr"/>
+        </a:solidFill>
+      </a:fillStyleLst>
+      <a:lnStyleLst>
+        <a:ln w="6350" cap="flat" cmpd="sng" algn="ctr">
+          <a:prstDash val="solid"/>
+          <a:miter/>
+        </a:ln>
+        <a:ln w="6350" cap="flat" cmpd="sng" algn="ctr">
+          <a:prstDash val="solid"/>
+          <a:miter/>
+        </a:ln>
+        <a:ln w="6350" cap="flat" cmpd="sng" algn="ctr">
+          <a:prstDash val="solid"/>
+          <a:miter/>
+        </a:ln>
+      </a:lnStyleLst>
+      <a:effectStyleLst>
+        <a:effectStyle>
+          <a:effectLst/>
+        </a:effectStyle>
+        <a:effectStyle>
+          <a:effectLst/>
+        </a:effectStyle>
+        <a:effectStyle>
+          <a:effectLst/>
+        </a:effectStyle>
+      </a:effectStyleLst>
+      <a:bgFillStyleLst>
+        <a:solidFill>
+          <a:schemeClr val="phClr"/>
+        </a:solidFill>
+        <a:solidFill>
+          <a:schemeClr val="phClr"/>
+        </a:solidFill>
+        <a:solidFill>
+          <a:schemeClr val="phClr"/>
+        </a:solidFill>
+      </a:bgFillStyleLst>
+    </a:fmtScheme>
+  </a:themeElements>
+</a:theme>
 </file>
</xml_diff>

<commit_message>
fix(documents): adjust signature table layout in contract template
Refine the bottom signature block structure in the contract application template so the performer/customer signature section renders correctly in generated documents.
</commit_message>
<xml_diff>
--- a/backend/src/main/resources/templates/documents/contract_application.docx
+++ b/backend/src/main/resources/templates/documents/contract_application.docx
@@ -40,9 +40,7 @@
                 <w:tab w:val="left" w:pos="0" w:leader="none"/>
               </w:tabs>
               <w:spacing w:before="0" w:after="0"/>
-              <w:rPr>
-                <w:rFonts w:ascii="Liberation Sans" w:hAnsi="Liberation Sans"/>
-              </w:rPr>
+              <w:rPr/>
             </w:pPr>
             <w:r>
               <w:rPr>
@@ -74,9 +72,7 @@
                 <w:tab w:val="left" w:pos="0" w:leader="none"/>
               </w:tabs>
               <w:spacing w:before="0" w:after="0"/>
-              <w:rPr>
-                <w:rFonts w:ascii="Liberation Sans" w:hAnsi="Liberation Sans"/>
-              </w:rPr>
+              <w:rPr/>
             </w:pPr>
             <w:r>
               <w:rPr>
@@ -97,9 +93,7 @@
                 <w:tab w:val="left" w:pos="0" w:leader="none"/>
               </w:tabs>
               <w:spacing w:before="0" w:after="0"/>
-              <w:rPr>
-                <w:rFonts w:ascii="Liberation Sans" w:hAnsi="Liberation Sans"/>
-              </w:rPr>
+              <w:rPr/>
             </w:pPr>
             <w:r>
               <w:rPr>
@@ -203,9 +197,7 @@
               <w:pStyle w:val="Normal"/>
               <w:widowControl w:val="false"/>
               <w:spacing w:before="0" w:after="0"/>
-              <w:rPr>
-                <w:rFonts w:ascii="Liberation Sans" w:hAnsi="Liberation Sans"/>
-              </w:rPr>
+              <w:rPr/>
             </w:pPr>
             <w:r>
               <w:rPr>
@@ -234,9 +226,7 @@
               <w:widowControl w:val="false"/>
               <w:spacing w:before="0" w:after="200"/>
               <w:jc w:val="center"/>
-              <w:rPr>
-                <w:rFonts w:ascii="Liberation Sans" w:hAnsi="Liberation Sans"/>
-              </w:rPr>
+              <w:rPr/>
             </w:pPr>
             <w:r>
               <w:rPr>
@@ -291,9 +281,7 @@
               <w:pStyle w:val="Normal"/>
               <w:widowControl w:val="false"/>
               <w:spacing w:before="0" w:after="0"/>
-              <w:rPr>
-                <w:rFonts w:ascii="Liberation Sans" w:hAnsi="Liberation Sans"/>
-              </w:rPr>
+              <w:rPr/>
             </w:pPr>
             <w:r>
               <w:rPr>
@@ -323,9 +311,7 @@
               <w:snapToGrid w:val="false"/>
               <w:spacing w:lineRule="auto" w:line="240" w:before="0" w:after="200"/>
               <w:jc w:val="both"/>
-              <w:rPr>
-                <w:rFonts w:ascii="Liberation Sans" w:hAnsi="Liberation Sans"/>
-              </w:rPr>
+              <w:rPr/>
             </w:pPr>
             <w:r>
               <w:rPr>
@@ -379,9 +365,7 @@
               <w:pStyle w:val="Normal"/>
               <w:widowControl w:val="false"/>
               <w:spacing w:before="0" w:after="0"/>
-              <w:rPr>
-                <w:rFonts w:ascii="Liberation Sans" w:hAnsi="Liberation Sans"/>
-              </w:rPr>
+              <w:rPr/>
             </w:pPr>
             <w:r>
               <w:rPr>
@@ -410,9 +394,7 @@
               <w:pStyle w:val="Normal"/>
               <w:widowControl w:val="false"/>
               <w:spacing w:before="0" w:after="0"/>
-              <w:rPr>
-                <w:rFonts w:ascii="Liberation Sans" w:hAnsi="Liberation Sans"/>
-              </w:rPr>
+              <w:rPr/>
             </w:pPr>
             <w:r>
               <w:rPr>
@@ -431,9 +413,7 @@
               <w:pStyle w:val="Normal"/>
               <w:widowControl w:val="false"/>
               <w:spacing w:before="0" w:after="0"/>
-              <w:rPr>
-                <w:rFonts w:ascii="Liberation Sans" w:hAnsi="Liberation Sans"/>
-              </w:rPr>
+              <w:rPr/>
             </w:pPr>
             <w:r>
               <w:rPr>
@@ -488,9 +468,7 @@
               <w:pStyle w:val="Normal"/>
               <w:widowControl w:val="false"/>
               <w:spacing w:before="0" w:after="0"/>
-              <w:rPr>
-                <w:rFonts w:ascii="Liberation Sans" w:hAnsi="Liberation Sans"/>
-              </w:rPr>
+              <w:rPr/>
             </w:pPr>
             <w:r>
               <w:rPr>
@@ -519,9 +497,7 @@
               <w:pStyle w:val="Normal"/>
               <w:widowControl w:val="false"/>
               <w:spacing w:before="0" w:after="0"/>
-              <w:rPr>
-                <w:rFonts w:ascii="Liberation Sans" w:hAnsi="Liberation Sans"/>
-              </w:rPr>
+              <w:rPr/>
             </w:pPr>
             <w:r>
               <w:rPr>
@@ -541,9 +517,7 @@
               <w:pStyle w:val="Normal"/>
               <w:widowControl w:val="false"/>
               <w:spacing w:before="0" w:after="0"/>
-              <w:rPr>
-                <w:rFonts w:ascii="Liberation Sans" w:hAnsi="Liberation Sans"/>
-              </w:rPr>
+              <w:rPr/>
             </w:pPr>
             <w:r>
               <w:rPr>
@@ -601,9 +575,7 @@
               <w:pStyle w:val="Normal"/>
               <w:widowControl w:val="false"/>
               <w:spacing w:before="0" w:after="0"/>
-              <w:rPr>
-                <w:rFonts w:ascii="Liberation Sans" w:hAnsi="Liberation Sans"/>
-              </w:rPr>
+              <w:rPr/>
             </w:pPr>
             <w:r>
               <w:rPr>
@@ -641,9 +613,7 @@
               <w:pStyle w:val="Normal"/>
               <w:widowControl w:val="false"/>
               <w:spacing w:before="0" w:after="0"/>
-              <w:rPr>
-                <w:rFonts w:ascii="Liberation Sans" w:hAnsi="Liberation Sans"/>
-              </w:rPr>
+              <w:rPr/>
             </w:pPr>
             <w:r>
               <w:rPr>
@@ -685,9 +655,7 @@
               <w:pStyle w:val="Normal"/>
               <w:widowControl w:val="false"/>
               <w:spacing w:before="0" w:after="0"/>
-              <w:rPr>
-                <w:rFonts w:ascii="Liberation Sans" w:hAnsi="Liberation Sans"/>
-              </w:rPr>
+              <w:rPr/>
             </w:pPr>
             <w:r>
               <w:rPr>
@@ -703,9 +671,7 @@
               <w:pStyle w:val="Normal"/>
               <w:widowControl w:val="false"/>
               <w:spacing w:before="0" w:after="0"/>
-              <w:rPr>
-                <w:rFonts w:ascii="Liberation Sans" w:hAnsi="Liberation Sans"/>
-              </w:rPr>
+              <w:rPr/>
             </w:pPr>
             <w:r>
               <w:rPr>
@@ -734,9 +700,7 @@
               <w:pStyle w:val="Normal"/>
               <w:widowControl w:val="false"/>
               <w:spacing w:before="0" w:after="0"/>
-              <w:rPr>
-                <w:rFonts w:ascii="Liberation Sans" w:hAnsi="Liberation Sans"/>
-              </w:rPr>
+              <w:rPr/>
             </w:pPr>
             <w:r>
               <w:rPr>
@@ -767,9 +731,7 @@
               <w:pStyle w:val="Normal"/>
               <w:widowControl w:val="false"/>
               <w:spacing w:before="0" w:after="0"/>
-              <w:rPr>
-                <w:rFonts w:ascii="Liberation Sans" w:hAnsi="Liberation Sans"/>
-              </w:rPr>
+              <w:rPr/>
             </w:pPr>
             <w:r>
               <w:rPr>
@@ -785,9 +747,7 @@
               <w:pStyle w:val="Normal"/>
               <w:widowControl w:val="false"/>
               <w:spacing w:before="0" w:after="0"/>
-              <w:rPr>
-                <w:rFonts w:ascii="Liberation Sans" w:hAnsi="Liberation Sans"/>
-              </w:rPr>
+              <w:rPr/>
             </w:pPr>
             <w:r>
               <w:rPr>
@@ -816,9 +776,7 @@
               <w:pStyle w:val="Normal"/>
               <w:widowControl w:val="false"/>
               <w:spacing w:before="0" w:after="0"/>
-              <w:rPr>
-                <w:rFonts w:ascii="Liberation Sans" w:hAnsi="Liberation Sans"/>
-              </w:rPr>
+              <w:rPr/>
             </w:pPr>
             <w:r>
               <w:rPr>
@@ -920,9 +878,7 @@
               <w:pStyle w:val="Normal"/>
               <w:widowControl w:val="false"/>
               <w:spacing w:before="0" w:after="0"/>
-              <w:rPr>
-                <w:rFonts w:ascii="Liberation Sans" w:hAnsi="Liberation Sans"/>
-              </w:rPr>
+              <w:rPr/>
             </w:pPr>
             <w:r>
               <w:rPr>
@@ -950,9 +906,7 @@
               <w:pStyle w:val="Normal"/>
               <w:widowControl w:val="false"/>
               <w:spacing w:before="0" w:after="0"/>
-              <w:rPr>
-                <w:rFonts w:ascii="Liberation Sans" w:hAnsi="Liberation Sans"/>
-              </w:rPr>
+              <w:rPr/>
             </w:pPr>
             <w:r>
               <w:rPr>
@@ -1005,9 +959,7 @@
               <w:pStyle w:val="Normal"/>
               <w:widowControl w:val="false"/>
               <w:spacing w:before="0" w:after="0"/>
-              <w:rPr>
-                <w:rFonts w:ascii="Liberation Sans" w:hAnsi="Liberation Sans"/>
-              </w:rPr>
+              <w:rPr/>
             </w:pPr>
             <w:r>
               <w:rPr>
@@ -1036,9 +988,7 @@
               <w:pStyle w:val="Normal"/>
               <w:widowControl w:val="false"/>
               <w:spacing w:before="0" w:after="0"/>
-              <w:rPr>
-                <w:rFonts w:ascii="Liberation Sans" w:hAnsi="Liberation Sans"/>
-              </w:rPr>
+              <w:rPr/>
             </w:pPr>
             <w:r>
               <w:rPr>
@@ -1092,9 +1042,7 @@
               <w:pStyle w:val="Normal"/>
               <w:widowControl w:val="false"/>
               <w:spacing w:before="0" w:after="0"/>
-              <w:rPr>
-                <w:rFonts w:ascii="Liberation Sans" w:hAnsi="Liberation Sans"/>
-              </w:rPr>
+              <w:rPr/>
             </w:pPr>
             <w:r>
               <w:rPr>
@@ -1122,9 +1070,7 @@
               <w:pStyle w:val="Normal"/>
               <w:widowControl w:val="false"/>
               <w:spacing w:before="0" w:after="0"/>
-              <w:rPr>
-                <w:rFonts w:ascii="Liberation Sans" w:hAnsi="Liberation Sans"/>
-              </w:rPr>
+              <w:rPr/>
             </w:pPr>
             <w:r>
               <w:rPr>
@@ -1176,9 +1122,7 @@
               <w:pStyle w:val="Normal"/>
               <w:widowControl w:val="false"/>
               <w:spacing w:lineRule="auto" w:line="240" w:before="0" w:after="0"/>
-              <w:rPr>
-                <w:rFonts w:ascii="Liberation Sans" w:hAnsi="Liberation Sans"/>
-              </w:rPr>
+              <w:rPr/>
             </w:pPr>
             <w:r>
               <w:rPr>
@@ -1206,9 +1150,7 @@
               <w:pStyle w:val="Normal"/>
               <w:widowControl w:val="false"/>
               <w:spacing w:before="0" w:after="0"/>
-              <w:rPr>
-                <w:rFonts w:ascii="Liberation Sans" w:hAnsi="Liberation Sans"/>
-              </w:rPr>
+              <w:rPr/>
             </w:pPr>
             <w:r>
               <w:rPr>
@@ -1249,9 +1191,7 @@
       <w:pPr>
         <w:pStyle w:val="Normal"/>
         <w:spacing w:before="0" w:after="0"/>
-        <w:rPr>
-          <w:rFonts w:ascii="Liberation Sans" w:hAnsi="Liberation Sans"/>
-        </w:rPr>
+        <w:rPr/>
       </w:pPr>
       <w:r>
         <w:rPr>
@@ -1266,9 +1206,7 @@
       <w:pPr>
         <w:pStyle w:val="Normal"/>
         <w:spacing w:before="0" w:after="0"/>
-        <w:rPr>
-          <w:rFonts w:ascii="Liberation Sans" w:hAnsi="Liberation Sans"/>
-        </w:rPr>
+        <w:rPr/>
       </w:pPr>
       <w:r>
         <w:rPr>
@@ -1283,9 +1221,7 @@
       <w:pPr>
         <w:pStyle w:val="Normal"/>
         <w:spacing w:before="0" w:after="0"/>
-        <w:rPr>
-          <w:rFonts w:ascii="Liberation Sans" w:hAnsi="Liberation Sans"/>
-        </w:rPr>
+        <w:rPr/>
       </w:pPr>
       <w:r>
         <w:rPr>
@@ -1300,9 +1236,7 @@
       <w:pPr>
         <w:pStyle w:val="Normal"/>
         <w:spacing w:before="0" w:after="0"/>
-        <w:rPr>
-          <w:rFonts w:ascii="Liberation Sans" w:hAnsi="Liberation Sans"/>
-        </w:rPr>
+        <w:rPr/>
       </w:pPr>
       <w:r>
         <w:rPr>
@@ -1317,9 +1251,7 @@
       <w:pPr>
         <w:pStyle w:val="Normal"/>
         <w:spacing w:before="0" w:after="0"/>
-        <w:rPr>
-          <w:rFonts w:ascii="Liberation Sans" w:hAnsi="Liberation Sans"/>
-        </w:rPr>
+        <w:rPr/>
       </w:pPr>
       <w:r>
         <w:rPr>
@@ -1370,9 +1302,7 @@
         <w:pStyle w:val="Style18"/>
         <w:bidi w:val="0"/>
         <w:jc w:val="left"/>
-        <w:rPr>
-          <w:rFonts w:ascii="Liberation Sans" w:hAnsi="Liberation Sans"/>
-        </w:rPr>
+        <w:rPr/>
       </w:pPr>
       <w:r>
         <w:rPr>
@@ -1457,9 +1387,7 @@
               <w:pStyle w:val="Normal"/>
               <w:widowControl w:val="false"/>
               <w:spacing w:lineRule="auto" w:line="240"/>
-              <w:rPr>
-                <w:rFonts w:ascii="Liberation Sans" w:hAnsi="Liberation Sans"/>
-              </w:rPr>
+              <w:rPr/>
             </w:pPr>
             <w:r>
               <w:rPr>
@@ -1556,9 +1484,7 @@
               <w:pStyle w:val="Style22"/>
               <w:widowControl w:val="false"/>
               <w:jc w:val="left"/>
-              <w:rPr>
-                <w:rFonts w:ascii="Liberation Sans" w:hAnsi="Liberation Sans"/>
-              </w:rPr>
+              <w:rPr/>
             </w:pPr>
             <w:r>
               <w:rPr>
@@ -1577,146 +1503,14 @@
           </w:p>
         </w:tc>
       </w:tr>
-      <w:tr>
-        <w:trPr/>
-        <w:tc>
-          <w:tcPr>
-            <w:tcW w:w="5494" w:type="dxa"/>
-            <w:tcBorders/>
-            <w:tcMar>
-              <w:left w:w="0" w:type="dxa"/>
-              <w:right w:w="0" w:type="dxa"/>
-            </w:tcMar>
-          </w:tcPr>
-          <w:p>
-            <w:pPr>
-              <w:pStyle w:val="Style18"/>
-              <w:widowControl w:val="false"/>
-              <w:bidi w:val="0"/>
-              <w:snapToGrid w:val="false"/>
-              <w:jc w:val="left"/>
-              <w:rPr>
-                <w:rFonts w:ascii="Liberation Sans" w:hAnsi="Liberation Sans" w:cs="Arial"/>
-                <w:b/>
-                <w:sz w:val="16"/>
-                <w:szCs w:val="16"/>
-              </w:rPr>
-            </w:pPr>
-            <w:r>
-              <w:rPr>
-                <w:rFonts w:cs="Arial" w:ascii="Liberation Sans" w:hAnsi="Liberation Sans"/>
-                <w:b/>
-                <w:sz w:val="16"/>
-                <w:szCs w:val="16"/>
-              </w:rPr>
-            </w:r>
-          </w:p>
-        </w:tc>
-        <w:tc>
-          <w:tcPr>
-            <w:tcW w:w="5493" w:type="dxa"/>
-            <w:tcBorders/>
-            <w:tcMar>
-              <w:left w:w="0" w:type="dxa"/>
-              <w:right w:w="0" w:type="dxa"/>
-            </w:tcMar>
-          </w:tcPr>
-          <w:p>
-            <w:pPr>
-              <w:pStyle w:val="Normal"/>
-              <w:widowControl w:val="false"/>
-              <w:snapToGrid w:val="false"/>
-              <w:spacing w:before="0" w:after="200"/>
-              <w:rPr>
-                <w:rFonts w:ascii="Liberation Sans" w:hAnsi="Liberation Sans" w:cs="Arial"/>
-                <w:b/>
-                <w:sz w:val="20"/>
-                <w:szCs w:val="20"/>
-              </w:rPr>
-            </w:pPr>
-            <w:r>
-              <w:rPr>
-                <w:rFonts w:cs="Arial" w:ascii="Liberation Sans" w:hAnsi="Liberation Sans"/>
-                <w:b/>
-                <w:sz w:val="20"/>
-                <w:szCs w:val="20"/>
-              </w:rPr>
-            </w:r>
-          </w:p>
-        </w:tc>
-      </w:tr>
     </w:tbl>
     <w:p>
       <w:pPr>
         <w:pStyle w:val="Style18"/>
         <w:bidi w:val="0"/>
         <w:jc w:val="left"/>
-        <w:rPr>
-          <w:rFonts w:ascii="Liberation Sans" w:hAnsi="Liberation Sans"/>
-        </w:rPr>
+        <w:rPr/>
       </w:pPr>
-      <w:r>
-        <mc:AlternateContent>
-          <mc:Choice Requires="wps">
-            <w:drawing>
-              <wp:anchor behindDoc="1" distT="5080" distB="5080" distL="5715" distR="4445" simplePos="0" locked="0" layoutInCell="1" allowOverlap="1" relativeHeight="2">
-                <wp:simplePos x="0" y="0"/>
-                <wp:positionH relativeFrom="column">
-                  <wp:posOffset>316230</wp:posOffset>
-                </wp:positionH>
-                <wp:positionV relativeFrom="paragraph">
-                  <wp:posOffset>115570</wp:posOffset>
-                </wp:positionV>
-                <wp:extent cx="6263005" cy="233680"/>
-                <wp:effectExtent l="5715" t="5080" r="4445" b="5080"/>
-                <wp:wrapNone/>
-                <wp:docPr id="1" name="Изображение1"/>
-                <a:graphic xmlns:a="http://schemas.openxmlformats.org/drawingml/2006/main">
-                  <a:graphicData uri="http://schemas.microsoft.com/office/word/2010/wordprocessingShape">
-                    <wps:wsp>
-                      <wps:cNvSpPr/>
-                      <wps:spPr>
-                        <a:xfrm>
-                          <a:off x="0" y="0"/>
-                          <a:ext cx="6262920" cy="233640"/>
-                        </a:xfrm>
-                        <a:prstGeom prst="rect">
-                          <a:avLst/>
-                        </a:prstGeom>
-                        <a:solidFill>
-                          <a:srgbClr val="ffffff"/>
-                        </a:solidFill>
-                        <a:ln cap="sq" w="9360">
-                          <a:solidFill>
-                            <a:srgbClr val="ffffff"/>
-                          </a:solidFill>
-                          <a:miter/>
-                        </a:ln>
-                      </wps:spPr>
-                      <wps:style>
-                        <a:lnRef idx="0"/>
-                        <a:fillRef idx="0"/>
-                        <a:effectRef idx="0"/>
-                        <a:fontRef idx="minor"/>
-                      </wps:style>
-                      <wps:bodyPr/>
-                    </wps:wsp>
-                  </a:graphicData>
-                </a:graphic>
-              </wp:anchor>
-            </w:drawing>
-          </mc:Choice>
-          <mc:Fallback>
-            <w:pict>
-              <v:rect id="shape_0" ID="Изображение1" path="m0,0l-2147483645,0l-2147483645,-2147483646l0,-2147483646xe" fillcolor="white" stroked="t" o:allowincell="f" style="position:absolute;margin-left:24.9pt;margin-top:9.1pt;width:493.1pt;height:18.35pt;mso-wrap-style:none;v-text-anchor:middle">
-                <v:fill o:detectmouseclick="t" type="solid" color2="black"/>
-                <v:stroke color="white" weight="9360" joinstyle="miter" endcap="square"/>
-                <w10:wrap type="none"/>
-              </v:rect>
-            </w:pict>
-          </mc:Fallback>
-        </mc:AlternateContent>
-      </w:r>
       <w:r>
         <w:rPr>
           <w:rFonts w:cs="Arial" w:ascii="Liberation Sans" w:hAnsi="Liberation Sans"/>
@@ -1731,273 +1525,430 @@
         <w:tab/>
       </w:r>
     </w:p>
+    <w:tbl>
+      <w:tblPr>
+        <w:tblW w:w="5000" w:type="pct"/>
+        <w:jc w:val="left"/>
+        <w:tblInd w:w="55" w:type="dxa"/>
+        <w:tblLayout w:type="fixed"/>
+        <w:tblCellMar>
+          <w:top w:w="55" w:type="dxa"/>
+          <w:left w:w="55" w:type="dxa"/>
+          <w:bottom w:w="55" w:type="dxa"/>
+          <w:right w:w="55" w:type="dxa"/>
+        </w:tblCellMar>
+      </w:tblPr>
+      <w:tblGrid>
+        <w:gridCol w:w="2306"/>
+        <w:gridCol w:w="544"/>
+        <w:gridCol w:w="1706"/>
+        <w:gridCol w:w="843"/>
+        <w:gridCol w:w="2344"/>
+        <w:gridCol w:w="591"/>
+        <w:gridCol w:w="1622"/>
+        <w:gridCol w:w="815"/>
+      </w:tblGrid>
+      <w:tr>
+        <w:trPr/>
+        <w:tc>
+          <w:tcPr>
+            <w:tcW w:w="4556" w:type="dxa"/>
+            <w:gridSpan w:val="3"/>
+            <w:tcBorders/>
+          </w:tcPr>
+          <w:p>
+            <w:pPr>
+              <w:pStyle w:val="Normal"/>
+              <w:spacing w:before="0" w:after="0"/>
+              <w:ind w:hanging="0" w:left="0" w:right="0"/>
+              <w:jc w:val="center"/>
+              <w:rPr/>
+            </w:pPr>
+            <w:r>
+              <w:rPr>
+                <w:rFonts w:cs="Arial" w:ascii="Liberation Sans" w:hAnsi="Liberation Sans"/>
+                <w:sz w:val="20"/>
+                <w:szCs w:val="20"/>
+              </w:rPr>
+              <w:t>ИСПОЛНИТЕЛЬ:</w:t>
+            </w:r>
+          </w:p>
+        </w:tc>
+        <w:tc>
+          <w:tcPr>
+            <w:tcW w:w="843" w:type="dxa"/>
+            <w:tcBorders/>
+          </w:tcPr>
+          <w:p>
+            <w:pPr>
+              <w:pStyle w:val="Normal"/>
+              <w:spacing w:before="0" w:after="0"/>
+              <w:ind w:hanging="0" w:left="0" w:right="0"/>
+              <w:rPr/>
+            </w:pPr>
+            <w:r>
+              <w:rPr/>
+            </w:r>
+          </w:p>
+        </w:tc>
+        <w:tc>
+          <w:tcPr>
+            <w:tcW w:w="4557" w:type="dxa"/>
+            <w:gridSpan w:val="3"/>
+            <w:tcBorders/>
+          </w:tcPr>
+          <w:p>
+            <w:pPr>
+              <w:pStyle w:val="Normal"/>
+              <w:spacing w:before="0" w:after="0"/>
+              <w:ind w:hanging="0" w:left="0" w:right="0"/>
+              <w:jc w:val="center"/>
+              <w:rPr/>
+            </w:pPr>
+            <w:r>
+              <w:rPr>
+                <w:rFonts w:cs="Arial" w:ascii="Liberation Sans" w:hAnsi="Liberation Sans"/>
+                <w:sz w:val="20"/>
+                <w:szCs w:val="20"/>
+              </w:rPr>
+              <w:t>ЗАКАЗЧИК:</w:t>
+            </w:r>
+          </w:p>
+        </w:tc>
+        <w:tc>
+          <w:tcPr>
+            <w:tcW w:w="815" w:type="dxa"/>
+            <w:tcBorders/>
+          </w:tcPr>
+          <w:p>
+            <w:pPr>
+              <w:pStyle w:val="Normal"/>
+              <w:spacing w:before="0" w:after="0"/>
+              <w:ind w:hanging="0" w:left="0" w:right="0"/>
+              <w:rPr/>
+            </w:pPr>
+            <w:r>
+              <w:rPr/>
+            </w:r>
+          </w:p>
+        </w:tc>
+      </w:tr>
+      <w:tr>
+        <w:trPr/>
+        <w:tc>
+          <w:tcPr>
+            <w:tcW w:w="2306" w:type="dxa"/>
+            <w:tcBorders/>
+          </w:tcPr>
+          <w:p>
+            <w:pPr>
+              <w:pStyle w:val="Normal"/>
+              <w:spacing w:before="0" w:after="0"/>
+              <w:jc w:val="right"/>
+              <w:rPr/>
+            </w:pPr>
+            <w:r>
+              <w:rPr>
+                <w:rFonts w:cs="Arial" w:ascii="Liberation Sans" w:hAnsi="Liberation Sans"/>
+                <w:b w:val="false"/>
+                <w:bCs w:val="false"/>
+                <w:sz w:val="20"/>
+                <w:szCs w:val="20"/>
+                <w:u w:val="none"/>
+                <w:lang w:val="en-US"/>
+              </w:rPr>
+              <w:t>__________________</w:t>
+            </w:r>
+            <w:r>
+              <w:rPr>
+                <w:rFonts w:cs="Arial" w:ascii="Liberation Sans" w:hAnsi="Liberation Sans"/>
+                <w:b w:val="false"/>
+                <w:bCs w:val="false"/>
+                <w:sz w:val="20"/>
+                <w:szCs w:val="20"/>
+                <w:u w:val="none"/>
+              </w:rPr>
+              <w:t xml:space="preserve"> </w:t>
+            </w:r>
+            <w:r>
+              <w:rPr>
+                <w:rFonts w:cs="Arial" w:ascii="Liberation Sans" w:hAnsi="Liberation Sans"/>
+                <w:b/>
+                <w:sz w:val="20"/>
+                <w:szCs w:val="20"/>
+                <w:u w:val="none"/>
+              </w:rPr>
+              <w:t>/</w:t>
+            </w:r>
+          </w:p>
+        </w:tc>
+        <w:tc>
+          <w:tcPr>
+            <w:tcW w:w="3093" w:type="dxa"/>
+            <w:gridSpan w:val="3"/>
+            <w:tcBorders/>
+          </w:tcPr>
+          <w:p>
+            <w:pPr>
+              <w:pStyle w:val="Normal"/>
+              <w:spacing w:before="0" w:after="0"/>
+              <w:rPr/>
+            </w:pPr>
+            <w:r>
+              <w:rPr>
+                <w:rFonts w:cs="Arial" w:ascii="Liberation Sans" w:hAnsi="Liberation Sans"/>
+                <w:b w:val="false"/>
+                <w:bCs w:val="false"/>
+                <w:sz w:val="20"/>
+                <w:szCs w:val="20"/>
+                <w:u w:val="none"/>
+                <w:lang w:val="en-US"/>
+              </w:rPr>
+              <w:t xml:space="preserve">__________________ </w:t>
+            </w:r>
+            <w:r>
+              <w:rPr>
+                <w:rFonts w:cs="Arial" w:ascii="Liberation Sans" w:hAnsi="Liberation Sans"/>
+                <w:b/>
+                <w:sz w:val="20"/>
+                <w:szCs w:val="20"/>
+                <w:u w:val="none"/>
+              </w:rPr>
+              <w:t>/</w:t>
+            </w:r>
+          </w:p>
+        </w:tc>
+        <w:tc>
+          <w:tcPr>
+            <w:tcW w:w="2344" w:type="dxa"/>
+            <w:tcBorders/>
+          </w:tcPr>
+          <w:p>
+            <w:pPr>
+              <w:pStyle w:val="Normal"/>
+              <w:spacing w:before="0" w:after="0"/>
+              <w:jc w:val="right"/>
+              <w:rPr/>
+            </w:pPr>
+            <w:r>
+              <w:rPr>
+                <w:rFonts w:cs="Arial" w:ascii="Liberation Sans" w:hAnsi="Liberation Sans"/>
+                <w:b w:val="false"/>
+                <w:bCs w:val="false"/>
+                <w:sz w:val="20"/>
+                <w:szCs w:val="20"/>
+                <w:u w:val="none"/>
+                <w:lang w:val="en-US"/>
+              </w:rPr>
+              <w:t>__________________</w:t>
+            </w:r>
+            <w:r>
+              <w:rPr>
+                <w:rFonts w:cs="Arial" w:ascii="Liberation Sans" w:hAnsi="Liberation Sans"/>
+                <w:b w:val="false"/>
+                <w:bCs w:val="false"/>
+                <w:sz w:val="20"/>
+                <w:szCs w:val="20"/>
+                <w:u w:val="none"/>
+              </w:rPr>
+              <w:t xml:space="preserve"> </w:t>
+            </w:r>
+            <w:r>
+              <w:rPr>
+                <w:rFonts w:cs="Arial" w:ascii="Liberation Sans" w:hAnsi="Liberation Sans"/>
+                <w:b/>
+                <w:sz w:val="20"/>
+                <w:szCs w:val="20"/>
+                <w:u w:val="none"/>
+              </w:rPr>
+              <w:t>/</w:t>
+            </w:r>
+          </w:p>
+        </w:tc>
+        <w:tc>
+          <w:tcPr>
+            <w:tcW w:w="3028" w:type="dxa"/>
+            <w:gridSpan w:val="3"/>
+            <w:tcBorders/>
+          </w:tcPr>
+          <w:p>
+            <w:pPr>
+              <w:pStyle w:val="Normal"/>
+              <w:spacing w:before="0" w:after="0"/>
+              <w:rPr/>
+            </w:pPr>
+            <w:r>
+              <w:rPr>
+                <w:rFonts w:cs="Arial" w:ascii="Liberation Sans" w:hAnsi="Liberation Sans"/>
+                <w:b w:val="false"/>
+                <w:bCs w:val="false"/>
+                <w:sz w:val="20"/>
+                <w:szCs w:val="20"/>
+                <w:u w:val="none"/>
+                <w:lang w:val="en-US"/>
+              </w:rPr>
+              <w:t xml:space="preserve">__________________ </w:t>
+            </w:r>
+            <w:r>
+              <w:rPr>
+                <w:rFonts w:cs="Arial" w:ascii="Liberation Sans" w:hAnsi="Liberation Sans"/>
+                <w:b/>
+                <w:sz w:val="20"/>
+                <w:szCs w:val="20"/>
+                <w:u w:val="none"/>
+              </w:rPr>
+              <w:t>/</w:t>
+            </w:r>
+          </w:p>
+        </w:tc>
+      </w:tr>
+      <w:tr>
+        <w:trPr/>
+        <w:tc>
+          <w:tcPr>
+            <w:tcW w:w="2306" w:type="dxa"/>
+            <w:tcBorders/>
+          </w:tcPr>
+          <w:p>
+            <w:pPr>
+              <w:pStyle w:val="Normal"/>
+              <w:spacing w:before="0" w:after="200"/>
+              <w:rPr>
+                <w:rFonts w:ascii="Liberation Sans" w:hAnsi="Liberation Sans" w:cs="Arial"/>
+                <w:b/>
+                <w:sz w:val="20"/>
+                <w:szCs w:val="20"/>
+                <w:u w:val="none"/>
+              </w:rPr>
+            </w:pPr>
+            <w:r>
+              <w:rPr/>
+            </w:r>
+          </w:p>
+        </w:tc>
+        <w:tc>
+          <w:tcPr>
+            <w:tcW w:w="544" w:type="dxa"/>
+            <w:tcBorders/>
+          </w:tcPr>
+          <w:p>
+            <w:pPr>
+              <w:pStyle w:val="Normal"/>
+              <w:spacing w:before="0" w:after="200"/>
+              <w:rPr>
+                <w:rFonts w:ascii="Liberation Sans" w:hAnsi="Liberation Sans" w:cs="Arial"/>
+                <w:sz w:val="20"/>
+                <w:szCs w:val="20"/>
+              </w:rPr>
+            </w:pPr>
+            <w:r>
+              <w:rPr>
+                <w:rFonts w:cs="Arial" w:ascii="Liberation Sans" w:hAnsi="Liberation Sans"/>
+                <w:sz w:val="20"/>
+                <w:szCs w:val="20"/>
+              </w:rPr>
+            </w:r>
+          </w:p>
+        </w:tc>
+        <w:tc>
+          <w:tcPr>
+            <w:tcW w:w="2549" w:type="dxa"/>
+            <w:gridSpan w:val="2"/>
+            <w:tcBorders/>
+          </w:tcPr>
+          <w:p>
+            <w:pPr>
+              <w:pStyle w:val="Normal"/>
+              <w:spacing w:before="0" w:after="200"/>
+              <w:rPr>
+                <w:rFonts w:ascii="Liberation Sans" w:hAnsi="Liberation Sans" w:cs="Arial"/>
+                <w:sz w:val="20"/>
+                <w:szCs w:val="20"/>
+              </w:rPr>
+            </w:pPr>
+            <w:r>
+              <w:rPr>
+                <w:rFonts w:cs="Arial" w:ascii="Liberation Sans" w:hAnsi="Liberation Sans"/>
+                <w:sz w:val="20"/>
+                <w:szCs w:val="20"/>
+              </w:rPr>
+              <w:t>М.П.</w:t>
+            </w:r>
+          </w:p>
+        </w:tc>
+        <w:tc>
+          <w:tcPr>
+            <w:tcW w:w="2344" w:type="dxa"/>
+            <w:tcBorders/>
+          </w:tcPr>
+          <w:p>
+            <w:pPr>
+              <w:pStyle w:val="Normal"/>
+              <w:spacing w:before="0" w:after="200"/>
+              <w:rPr>
+                <w:rFonts w:ascii="Liberation Sans" w:hAnsi="Liberation Sans" w:cs="Arial"/>
+                <w:b/>
+                <w:sz w:val="20"/>
+                <w:szCs w:val="20"/>
+              </w:rPr>
+            </w:pPr>
+            <w:r>
+              <w:rPr>
+                <w:rFonts w:cs="Arial" w:ascii="Liberation Sans" w:hAnsi="Liberation Sans"/>
+                <w:b/>
+                <w:sz w:val="20"/>
+                <w:szCs w:val="20"/>
+              </w:rPr>
+            </w:r>
+          </w:p>
+        </w:tc>
+        <w:tc>
+          <w:tcPr>
+            <w:tcW w:w="591" w:type="dxa"/>
+            <w:tcBorders/>
+          </w:tcPr>
+          <w:p>
+            <w:pPr>
+              <w:pStyle w:val="Normal"/>
+              <w:spacing w:before="0" w:after="200"/>
+              <w:rPr>
+                <w:u w:val="none"/>
+              </w:rPr>
+            </w:pPr>
+            <w:r>
+              <w:rPr>
+                <w:u w:val="none"/>
+              </w:rPr>
+            </w:r>
+          </w:p>
+        </w:tc>
+        <w:tc>
+          <w:tcPr>
+            <w:tcW w:w="2437" w:type="dxa"/>
+            <w:gridSpan w:val="2"/>
+            <w:tcBorders/>
+          </w:tcPr>
+          <w:p>
+            <w:pPr>
+              <w:pStyle w:val="Normal"/>
+              <w:spacing w:before="0" w:after="200"/>
+              <w:rPr/>
+            </w:pPr>
+            <w:r>
+              <w:rPr/>
+              <w:t>М.П.</w:t>
+            </w:r>
+          </w:p>
+        </w:tc>
+      </w:tr>
+    </w:tbl>
     <w:p>
       <w:pPr>
         <w:pStyle w:val="Normal"/>
-        <w:spacing w:before="0" w:after="0"/>
-        <w:ind w:firstLine="708" w:left="0" w:right="0"/>
-        <w:rPr>
-          <w:rFonts w:ascii="Liberation Sans" w:hAnsi="Liberation Sans"/>
-        </w:rPr>
-      </w:pPr>
-      <w:r>
-        <w:rPr>
-          <w:rFonts w:cs="Arial" w:ascii="Liberation Sans" w:hAnsi="Liberation Sans"/>
-          <w:sz w:val="20"/>
-          <w:szCs w:val="20"/>
-        </w:rPr>
-        <w:t>ИСПОЛНИТЕЛЬ:</w:t>
-        <w:tab/>
-        <w:tab/>
-        <w:tab/>
-        <w:tab/>
-        <w:tab/>
-        <w:tab/>
-        <w:tab/>
-        <w:t>ЗАКАЗЧИК:</w:t>
-      </w:r>
-    </w:p>
-    <w:p>
-      <w:pPr>
-        <w:pStyle w:val="Normal"/>
-        <w:spacing w:before="0" w:after="0"/>
-        <w:rPr>
-          <w:rFonts w:ascii="Liberation Sans" w:hAnsi="Liberation Sans"/>
-        </w:rPr>
-      </w:pPr>
-      <w:r>
-        <mc:AlternateContent>
-          <mc:Choice Requires="wps">
-            <w:drawing>
-              <wp:anchor behindDoc="0" distT="5715" distB="4445" distL="5715" distR="4445" simplePos="0" locked="0" layoutInCell="1" allowOverlap="1" relativeHeight="3">
-                <wp:simplePos x="0" y="0"/>
-                <wp:positionH relativeFrom="column">
-                  <wp:posOffset>40005</wp:posOffset>
-                </wp:positionH>
-                <wp:positionV relativeFrom="paragraph">
-                  <wp:posOffset>1400810</wp:posOffset>
-                </wp:positionV>
-                <wp:extent cx="6739255" cy="281305"/>
-                <wp:effectExtent l="5715" t="5715" r="4445" b="4445"/>
-                <wp:wrapNone/>
-                <wp:docPr id="2" name="Изображение2"/>
-                <a:graphic xmlns:a="http://schemas.openxmlformats.org/drawingml/2006/main">
-                  <a:graphicData uri="http://schemas.microsoft.com/office/word/2010/wordprocessingShape">
-                    <wps:wsp>
-                      <wps:cNvSpPr/>
-                      <wps:spPr>
-                        <a:xfrm>
-                          <a:off x="0" y="0"/>
-                          <a:ext cx="6739200" cy="281160"/>
-                        </a:xfrm>
-                        <a:prstGeom prst="rect">
-                          <a:avLst/>
-                        </a:prstGeom>
-                        <a:solidFill>
-                          <a:srgbClr val="ffffff"/>
-                        </a:solidFill>
-                        <a:ln cap="sq" w="9360">
-                          <a:solidFill>
-                            <a:srgbClr val="ffffff"/>
-                          </a:solidFill>
-                          <a:miter/>
-                        </a:ln>
-                      </wps:spPr>
-                      <wps:style>
-                        <a:lnRef idx="0"/>
-                        <a:fillRef idx="0"/>
-                        <a:effectRef idx="0"/>
-                        <a:fontRef idx="minor"/>
-                      </wps:style>
-                      <wps:bodyPr/>
-                    </wps:wsp>
-                  </a:graphicData>
-                </a:graphic>
-              </wp:anchor>
-            </w:drawing>
-          </mc:Choice>
-          <mc:Fallback>
-            <w:pict>
-              <v:rect id="shape_0" ID="Изображение2" path="m0,0l-2147483645,0l-2147483645,-2147483646l0,-2147483646xe" fillcolor="white" stroked="t" o:allowincell="f" style="position:absolute;margin-left:3.15pt;margin-top:110.3pt;width:530.6pt;height:22.1pt;mso-wrap-style:none;v-text-anchor:middle">
-                <v:fill o:detectmouseclick="t" type="solid" color2="black"/>
-                <v:stroke color="white" weight="9360" joinstyle="miter" endcap="square"/>
-                <w10:wrap type="none"/>
-              </v:rect>
-            </w:pict>
-          </mc:Fallback>
-        </mc:AlternateContent>
-        <mc:AlternateContent>
-          <mc:Choice Requires="wps">
-            <w:drawing>
-              <wp:anchor behindDoc="0" distT="5080" distB="5080" distL="5715" distR="4445" simplePos="0" locked="0" layoutInCell="1" allowOverlap="1" relativeHeight="4">
-                <wp:simplePos x="0" y="0"/>
-                <wp:positionH relativeFrom="column">
-                  <wp:posOffset>144780</wp:posOffset>
-                </wp:positionH>
-                <wp:positionV relativeFrom="paragraph">
-                  <wp:posOffset>636270</wp:posOffset>
-                </wp:positionV>
-                <wp:extent cx="6853555" cy="405130"/>
-                <wp:effectExtent l="5715" t="5080" r="4445" b="5080"/>
-                <wp:wrapNone/>
-                <wp:docPr id="3" name="Изображение3"/>
-                <a:graphic xmlns:a="http://schemas.openxmlformats.org/drawingml/2006/main">
-                  <a:graphicData uri="http://schemas.microsoft.com/office/word/2010/wordprocessingShape">
-                    <wps:wsp>
-                      <wps:cNvSpPr/>
-                      <wps:spPr>
-                        <a:xfrm>
-                          <a:off x="0" y="0"/>
-                          <a:ext cx="6853680" cy="405000"/>
-                        </a:xfrm>
-                        <a:prstGeom prst="rect">
-                          <a:avLst/>
-                        </a:prstGeom>
-                        <a:solidFill>
-                          <a:srgbClr val="ffffff"/>
-                        </a:solidFill>
-                        <a:ln cap="sq" w="9360">
-                          <a:solidFill>
-                            <a:srgbClr val="ffffff"/>
-                          </a:solidFill>
-                          <a:miter/>
-                        </a:ln>
-                      </wps:spPr>
-                      <wps:style>
-                        <a:lnRef idx="0"/>
-                        <a:fillRef idx="0"/>
-                        <a:effectRef idx="0"/>
-                        <a:fontRef idx="minor"/>
-                      </wps:style>
-                      <wps:bodyPr/>
-                    </wps:wsp>
-                  </a:graphicData>
-                </a:graphic>
-              </wp:anchor>
-            </w:drawing>
-          </mc:Choice>
-          <mc:Fallback>
-            <w:pict>
-              <v:rect id="shape_0" ID="Изображение3" path="m0,0l-2147483645,0l-2147483645,-2147483646l0,-2147483646xe" fillcolor="white" stroked="t" o:allowincell="f" style="position:absolute;margin-left:11.4pt;margin-top:50.1pt;width:539.6pt;height:31.85pt;mso-wrap-style:none;v-text-anchor:middle">
-                <v:fill o:detectmouseclick="t" type="solid" color2="black"/>
-                <v:stroke color="white" weight="9360" joinstyle="miter" endcap="square"/>
-                <w10:wrap type="none"/>
-              </v:rect>
-            </w:pict>
-          </mc:Fallback>
-        </mc:AlternateContent>
-      </w:r>
-      <w:r>
-        <w:rPr>
-          <w:rFonts w:cs="Arial" w:ascii="Liberation Sans" w:hAnsi="Liberation Sans"/>
-          <w:b/>
-          <w:sz w:val="20"/>
-          <w:szCs w:val="20"/>
-          <w:u w:val="single"/>
-        </w:rPr>
-        <w:tab/>
-        <w:tab/>
-        <w:tab/>
-      </w:r>
-      <w:r>
-        <w:rPr>
-          <w:rFonts w:cs="Arial" w:ascii="Liberation Sans" w:hAnsi="Liberation Sans"/>
-          <w:b/>
-          <w:sz w:val="20"/>
-          <w:szCs w:val="20"/>
-        </w:rPr>
-        <w:t xml:space="preserve"> </w:t>
-      </w:r>
-      <w:r>
-        <w:rPr>
-          <w:rFonts w:cs="Arial" w:ascii="Liberation Sans" w:hAnsi="Liberation Sans"/>
-          <w:b/>
-          <w:sz w:val="20"/>
-          <w:szCs w:val="20"/>
-          <w:u w:val="single"/>
-        </w:rPr>
-        <w:t>/                                /</w:t>
-      </w:r>
-      <w:r>
-        <w:rPr>
-          <w:rFonts w:cs="Arial" w:ascii="Liberation Sans" w:hAnsi="Liberation Sans"/>
-          <w:b/>
-          <w:sz w:val="20"/>
-          <w:szCs w:val="20"/>
-        </w:rPr>
-        <w:tab/>
-        <w:tab/>
-        <w:t xml:space="preserve">           </w:t>
-        <w:tab/>
-        <w:tab/>
-        <w:t xml:space="preserve">    </w:t>
-      </w:r>
-      <w:r>
-        <w:rPr>
-          <w:rFonts w:cs="Arial" w:ascii="Liberation Sans" w:hAnsi="Liberation Sans"/>
-          <w:b/>
-          <w:sz w:val="20"/>
-          <w:szCs w:val="20"/>
-          <w:u w:val="single"/>
-        </w:rPr>
-        <w:tab/>
-        <w:tab/>
-        <w:tab/>
-      </w:r>
-      <w:r>
-        <w:rPr>
-          <w:rFonts w:cs="Arial" w:ascii="Liberation Sans" w:hAnsi="Liberation Sans"/>
-          <w:b/>
-          <w:sz w:val="20"/>
-          <w:szCs w:val="20"/>
-        </w:rPr>
-        <w:t xml:space="preserve"> </w:t>
-      </w:r>
-      <w:r>
-        <w:rPr>
-          <w:rFonts w:cs="Arial" w:ascii="Liberation Sans" w:hAnsi="Liberation Sans"/>
-          <w:b/>
-          <w:sz w:val="20"/>
-          <w:szCs w:val="20"/>
-          <w:u w:val="single"/>
-        </w:rPr>
-        <w:t>/                                /</w:t>
-      </w:r>
-      <w:r>
-        <w:rPr>
-          <w:rFonts w:cs="Arial" w:ascii="Liberation Sans" w:hAnsi="Liberation Sans"/>
-          <w:b/>
-          <w:sz w:val="20"/>
-          <w:szCs w:val="20"/>
-        </w:rPr>
-        <w:tab/>
-      </w:r>
-      <w:r>
-        <w:rPr>
-          <w:rFonts w:cs="Arial" w:ascii="Liberation Sans" w:hAnsi="Liberation Sans"/>
-          <w:sz w:val="20"/>
-          <w:szCs w:val="20"/>
-        </w:rPr>
-        <w:tab/>
-        <w:tab/>
-        <w:t xml:space="preserve">        М.П.</w:t>
-        <w:tab/>
-        <w:tab/>
-        <w:tab/>
-        <w:tab/>
-        <w:tab/>
-        <w:tab/>
-        <w:tab/>
-        <w:tab/>
-        <w:t xml:space="preserve">        М.П.</w:t>
-        <w:tab/>
-        <w:tab/>
-      </w:r>
-    </w:p>
-    <w:p>
-      <w:pPr>
-        <w:pStyle w:val="Normal"/>
-        <w:spacing w:before="0" w:after="0"/>
+        <w:widowControl/>
+        <w:bidi w:val="0"/>
+        <w:spacing w:lineRule="auto" w:line="276" w:before="0" w:after="0"/>
+        <w:jc w:val="left"/>
         <w:rPr>
           <w:rFonts w:ascii="Liberation Sans" w:hAnsi="Liberation Sans" w:cs="Arial"/>
           <w:sz w:val="20"/>
@@ -2303,6 +2254,29 @@
       <w:rFonts w:ascii="Arial" w:hAnsi="Arial" w:eastAsia="Courier New" w:cs="Courier New"/>
       <w:sz w:val="20"/>
       <w:szCs w:val="20"/>
+    </w:rPr>
+  </w:style>
+  <w:style w:type="paragraph" w:styleId="TableContents">
+    <w:name w:val="Table Contents"/>
+    <w:basedOn w:val="Normal"/>
+    <w:qFormat/>
+    <w:pPr>
+      <w:widowControl w:val="false"/>
+      <w:suppressLineNumbers/>
+    </w:pPr>
+    <w:rPr/>
+  </w:style>
+  <w:style w:type="paragraph" w:styleId="TableHeading">
+    <w:name w:val="Table Heading"/>
+    <w:basedOn w:val="TableContents"/>
+    <w:qFormat/>
+    <w:pPr>
+      <w:suppressLineNumbers/>
+      <w:jc w:val="center"/>
+    </w:pPr>
+    <w:rPr>
+      <w:b/>
+      <w:bCs/>
     </w:rPr>
   </w:style>
 </w:styles>

</xml_diff>

<commit_message>
docs(templates): widen contact table and fix entrepreneur wrap in waybill
Adjust Word layouts: larger parties/requisites table in contact section (contract application); line break for Предприниматель label on waybill.
</commit_message>
<xml_diff>
--- a/backend/src/main/resources/templates/documents/contract_application.docx
+++ b/backend/src/main/resources/templates/documents/contract_application.docx
@@ -1356,32 +1356,14 @@
         <w:gridCol w:w="5493"/>
       </w:tblGrid>
       <w:tr>
-        <w:trPr/>
+        <w:trPr>
+          <w:trHeight w:val="4256" w:hRule="atLeast"/>
+        </w:trPr>
         <w:tc>
           <w:tcPr>
             <w:tcW w:w="5494" w:type="dxa"/>
             <w:tcBorders/>
           </w:tcPr>
-          <w:p>
-            <w:pPr>
-              <w:pStyle w:val="Normal"/>
-              <w:widowControl w:val="false"/>
-              <w:snapToGrid w:val="false"/>
-              <w:spacing w:lineRule="auto" w:line="240"/>
-              <w:rPr>
-                <w:rFonts w:ascii="Liberation Sans" w:hAnsi="Liberation Sans" w:cs="Times New Roman"/>
-                <w:b/>
-                <w:bCs/>
-              </w:rPr>
-            </w:pPr>
-            <w:r>
-              <w:rPr>
-                <w:rFonts w:cs="Times New Roman" w:ascii="Liberation Sans" w:hAnsi="Liberation Sans"/>
-                <w:b/>
-                <w:bCs/>
-              </w:rPr>
-            </w:r>
-          </w:p>
           <w:p>
             <w:pPr>
               <w:pStyle w:val="Normal"/>
@@ -1456,29 +1438,6 @@
             <w:tcW w:w="5493" w:type="dxa"/>
             <w:tcBorders/>
           </w:tcPr>
-          <w:p>
-            <w:pPr>
-              <w:pStyle w:val="Normal"/>
-              <w:widowControl w:val="false"/>
-              <w:snapToGrid w:val="false"/>
-              <w:rPr>
-                <w:rFonts w:ascii="Liberation Sans" w:hAnsi="Liberation Sans" w:cs="Times New Roman"/>
-                <w:b/>
-                <w:color w:val="000000"/>
-                <w:sz w:val="20"/>
-                <w:szCs w:val="20"/>
-              </w:rPr>
-            </w:pPr>
-            <w:r>
-              <w:rPr>
-                <w:rFonts w:cs="Times New Roman" w:ascii="Liberation Sans" w:hAnsi="Liberation Sans"/>
-                <w:b/>
-                <w:color w:val="000000"/>
-                <w:sz w:val="20"/>
-                <w:szCs w:val="20"/>
-              </w:rPr>
-            </w:r>
-          </w:p>
           <w:p>
             <w:pPr>
               <w:pStyle w:val="Style22"/>
@@ -1822,7 +1781,13 @@
               </w:rPr>
             </w:pPr>
             <w:r>
-              <w:rPr/>
+              <w:rPr>
+                <w:rFonts w:cs="Arial" w:ascii="Liberation Sans" w:hAnsi="Liberation Sans"/>
+                <w:b/>
+                <w:sz w:val="20"/>
+                <w:szCs w:val="20"/>
+                <w:u w:val="none"/>
+              </w:rPr>
             </w:r>
           </w:p>
         </w:tc>

</xml_diff>